<commit_message>
Capstone report: every heading starts on a new page, pages balanced
Co-Authored-By: Claude Sonnet 5.5 <noreply@anthropic.com>
Claude-Session: https://claude.ai/code/session_0119xxGj3NY185HcqPsLitZ4
</commit_message>
<xml_diff>
--- a/capstone/Capstone_Student_Course_Registration_System.docx
+++ b/capstone/Capstone_Student_Course_Registration_System.docx
@@ -2065,7 +2065,7 @@
                 <w:rFonts w:ascii="Times New Roman" w:hAnsi="Times New Roman"/>
                 <w:sz w:val="24"/>
               </w:rPr>
-              <w:t>4</w:t>
+              <w:t>5</w:t>
             </w:r>
           </w:p>
         </w:tc>
@@ -2145,7 +2145,7 @@
                 <w:rFonts w:ascii="Times New Roman" w:hAnsi="Times New Roman"/>
                 <w:sz w:val="24"/>
               </w:rPr>
-              <w:t>5</w:t>
+              <w:t>7</w:t>
             </w:r>
           </w:p>
         </w:tc>
@@ -2222,7 +2222,7 @@
                 <w:rFonts w:ascii="Times New Roman" w:hAnsi="Times New Roman"/>
                 <w:sz w:val="24"/>
               </w:rPr>
-              <w:t>7</w:t>
+              <w:t>9</w:t>
             </w:r>
           </w:p>
         </w:tc>
@@ -2299,7 +2299,7 @@
                 <w:rFonts w:ascii="Times New Roman" w:hAnsi="Times New Roman"/>
                 <w:sz w:val="24"/>
               </w:rPr>
-              <w:t>9</w:t>
+              <w:t>11</w:t>
             </w:r>
           </w:p>
         </w:tc>
@@ -2379,7 +2379,7 @@
                 <w:rFonts w:ascii="Times New Roman" w:hAnsi="Times New Roman"/>
                 <w:sz w:val="24"/>
               </w:rPr>
-              <w:t>16</w:t>
+              <w:t>19</w:t>
             </w:r>
           </w:p>
         </w:tc>
@@ -3313,6 +3313,7 @@
     <w:p>
       <w:pPr>
         <w:keepNext/>
+        <w:pageBreakBefore/>
         <w:pBdr>
           <w:bottom w:val="single" w:sz="8" w:space="1" w:color="000000"/>
         </w:pBdr>
@@ -4084,6 +4085,1245 @@
     <w:p>
       <w:pPr>
         <w:keepNext/>
+        <w:spacing w:after="80" w:before="120" w:line="276" w:lineRule="auto"/>
+        <w:jc w:val="left"/>
+      </w:pPr>
+      <w:r>
+        <w:rPr>
+          <w:rFonts w:ascii="Times New Roman" w:hAnsi="Times New Roman" w:eastAsia="Times New Roman"/>
+          <w:b/>
+          <w:i w:val="0"/>
+          <w:sz w:val="24"/>
+        </w:rPr>
+        <w:t>1.7 Existing system versus proposed system</w:t>
+      </w:r>
+    </w:p>
+    <w:tbl>
+      <w:tblPr>
+        <w:tblW w:type="auto" w:w="0"/>
+        <w:tblBorders>
+          <w:top w:val="single" w:sz="6" w:space="0" w:color="000000"/>
+          <w:left w:val="single" w:sz="6" w:space="0" w:color="000000"/>
+          <w:bottom w:val="single" w:sz="6" w:space="0" w:color="000000"/>
+          <w:right w:val="single" w:sz="6" w:space="0" w:color="000000"/>
+          <w:insideH w:val="single" w:sz="6" w:space="0" w:color="000000"/>
+          <w:insideV w:val="single" w:sz="6" w:space="0" w:color="000000"/>
+        </w:tblBorders>
+        <w:tblLayout w:type="fixed"/>
+        <w:tblLook w:firstColumn="1" w:firstRow="1" w:lastColumn="0" w:lastRow="0" w:noHBand="0" w:noVBand="1" w:val="04A0"/>
+      </w:tblPr>
+      <w:tblGrid>
+        <w:gridCol w:w="2160"/>
+        <w:gridCol w:w="3456"/>
+        <w:gridCol w:w="3600"/>
+      </w:tblGrid>
+      <w:tr>
+        <w:trPr>
+          <w:tblHeader/>
+          <w:cantSplit/>
+        </w:trPr>
+        <w:tc>
+          <w:tcPr>
+            <w:tcW w:type="dxa" w:w="2160"/>
+            <w:shd w:val="clear" w:color="auto" w:fill="D9E2D5"/>
+          </w:tcPr>
+          <w:p>
+            <w:pPr>
+              <w:keepNext/>
+              <w:spacing w:after="40" w:before="40"/>
+              <w:jc w:val="center"/>
+            </w:pPr>
+            <w:r>
+              <w:rPr>
+                <w:rFonts w:ascii="Times New Roman" w:hAnsi="Times New Roman"/>
+                <w:b/>
+                <w:sz w:val="22"/>
+              </w:rPr>
+              <w:t>Aspect</w:t>
+            </w:r>
+          </w:p>
+        </w:tc>
+        <w:tc>
+          <w:tcPr>
+            <w:tcW w:type="dxa" w:w="3456"/>
+            <w:shd w:val="clear" w:color="auto" w:fill="D9E2D5"/>
+          </w:tcPr>
+          <w:p>
+            <w:pPr>
+              <w:keepNext/>
+              <w:spacing w:after="40" w:before="40"/>
+              <w:jc w:val="center"/>
+            </w:pPr>
+            <w:r>
+              <w:rPr>
+                <w:rFonts w:ascii="Times New Roman" w:hAnsi="Times New Roman"/>
+                <w:b/>
+                <w:sz w:val="22"/>
+              </w:rPr>
+              <w:t>Manual / paper based system</w:t>
+            </w:r>
+          </w:p>
+        </w:tc>
+        <w:tc>
+          <w:tcPr>
+            <w:tcW w:type="dxa" w:w="3600"/>
+            <w:shd w:val="clear" w:color="auto" w:fill="D9E2D5"/>
+          </w:tcPr>
+          <w:p>
+            <w:pPr>
+              <w:keepNext/>
+              <w:spacing w:after="40" w:before="40"/>
+              <w:jc w:val="center"/>
+            </w:pPr>
+            <w:r>
+              <w:rPr>
+                <w:rFonts w:ascii="Times New Roman" w:hAnsi="Times New Roman"/>
+                <w:b/>
+                <w:sz w:val="22"/>
+              </w:rPr>
+              <w:t>Proposed web application</w:t>
+            </w:r>
+          </w:p>
+        </w:tc>
+      </w:tr>
+      <w:tr>
+        <w:trPr>
+          <w:cantSplit/>
+        </w:trPr>
+        <w:tc>
+          <w:tcPr>
+            <w:tcW w:type="dxa" w:w="2160"/>
+          </w:tcPr>
+          <w:p>
+            <w:pPr>
+              <w:keepNext/>
+              <w:spacing w:after="40" w:before="40"/>
+              <w:jc w:val="left"/>
+            </w:pPr>
+            <w:r>
+              <w:rPr>
+                <w:rFonts w:ascii="Times New Roman" w:hAnsi="Times New Roman"/>
+                <w:b/>
+                <w:sz w:val="22"/>
+              </w:rPr>
+              <w:t>Registration time</w:t>
+            </w:r>
+          </w:p>
+        </w:tc>
+        <w:tc>
+          <w:tcPr>
+            <w:tcW w:type="dxa" w:w="3456"/>
+          </w:tcPr>
+          <w:p>
+            <w:pPr>
+              <w:keepNext/>
+              <w:spacing w:after="40" w:before="40"/>
+              <w:jc w:val="left"/>
+            </w:pPr>
+            <w:r>
+              <w:rPr>
+                <w:rFonts w:ascii="Times New Roman" w:hAnsi="Times New Roman"/>
+                <w:b w:val="0"/>
+                <w:sz w:val="22"/>
+              </w:rPr>
+              <w:t>Long queues and several days</w:t>
+            </w:r>
+          </w:p>
+        </w:tc>
+        <w:tc>
+          <w:tcPr>
+            <w:tcW w:type="dxa" w:w="3600"/>
+          </w:tcPr>
+          <w:p>
+            <w:pPr>
+              <w:keepNext/>
+              <w:spacing w:after="40" w:before="40"/>
+              <w:jc w:val="left"/>
+            </w:pPr>
+            <w:r>
+              <w:rPr>
+                <w:rFonts w:ascii="Times New Roman" w:hAnsi="Times New Roman"/>
+                <w:b w:val="0"/>
+                <w:sz w:val="22"/>
+              </w:rPr>
+              <w:t>A few minutes from any device</w:t>
+            </w:r>
+          </w:p>
+        </w:tc>
+      </w:tr>
+      <w:tr>
+        <w:trPr>
+          <w:cantSplit/>
+        </w:trPr>
+        <w:tc>
+          <w:tcPr>
+            <w:tcW w:type="dxa" w:w="2160"/>
+          </w:tcPr>
+          <w:p>
+            <w:pPr>
+              <w:keepNext/>
+              <w:spacing w:after="40" w:before="40"/>
+              <w:jc w:val="left"/>
+            </w:pPr>
+            <w:r>
+              <w:rPr>
+                <w:rFonts w:ascii="Times New Roman" w:hAnsi="Times New Roman"/>
+                <w:b/>
+                <w:sz w:val="22"/>
+              </w:rPr>
+              <w:t>Seat checking</w:t>
+            </w:r>
+          </w:p>
+        </w:tc>
+        <w:tc>
+          <w:tcPr>
+            <w:tcW w:type="dxa" w:w="3456"/>
+          </w:tcPr>
+          <w:p>
+            <w:pPr>
+              <w:keepNext/>
+              <w:spacing w:after="40" w:before="40"/>
+              <w:jc w:val="left"/>
+            </w:pPr>
+            <w:r>
+              <w:rPr>
+                <w:rFonts w:ascii="Times New Roman" w:hAnsi="Times New Roman"/>
+                <w:b w:val="0"/>
+                <w:sz w:val="22"/>
+              </w:rPr>
+              <w:t>Counted by the staff by hand</w:t>
+            </w:r>
+          </w:p>
+        </w:tc>
+        <w:tc>
+          <w:tcPr>
+            <w:tcW w:type="dxa" w:w="3600"/>
+          </w:tcPr>
+          <w:p>
+            <w:pPr>
+              <w:keepNext/>
+              <w:spacing w:after="40" w:before="40"/>
+              <w:jc w:val="left"/>
+            </w:pPr>
+            <w:r>
+              <w:rPr>
+                <w:rFonts w:ascii="Times New Roman" w:hAnsi="Times New Roman"/>
+                <w:b w:val="0"/>
+                <w:sz w:val="22"/>
+              </w:rPr>
+              <w:t>Seats left are calculated automatically</w:t>
+            </w:r>
+          </w:p>
+        </w:tc>
+      </w:tr>
+      <w:tr>
+        <w:trPr>
+          <w:cantSplit/>
+        </w:trPr>
+        <w:tc>
+          <w:tcPr>
+            <w:tcW w:type="dxa" w:w="2160"/>
+          </w:tcPr>
+          <w:p>
+            <w:pPr>
+              <w:keepNext/>
+              <w:spacing w:after="40" w:before="40"/>
+              <w:jc w:val="left"/>
+            </w:pPr>
+            <w:r>
+              <w:rPr>
+                <w:rFonts w:ascii="Times New Roman" w:hAnsi="Times New Roman"/>
+                <w:b/>
+                <w:sz w:val="22"/>
+              </w:rPr>
+              <w:t>Time-table clash</w:t>
+            </w:r>
+          </w:p>
+        </w:tc>
+        <w:tc>
+          <w:tcPr>
+            <w:tcW w:type="dxa" w:w="3456"/>
+          </w:tcPr>
+          <w:p>
+            <w:pPr>
+              <w:keepNext/>
+              <w:spacing w:after="40" w:before="40"/>
+              <w:jc w:val="left"/>
+            </w:pPr>
+            <w:r>
+              <w:rPr>
+                <w:rFonts w:ascii="Times New Roman" w:hAnsi="Times New Roman"/>
+                <w:b w:val="0"/>
+                <w:sz w:val="22"/>
+              </w:rPr>
+              <w:t>Found only after registration</w:t>
+            </w:r>
+          </w:p>
+        </w:tc>
+        <w:tc>
+          <w:tcPr>
+            <w:tcW w:type="dxa" w:w="3600"/>
+          </w:tcPr>
+          <w:p>
+            <w:pPr>
+              <w:keepNext/>
+              <w:spacing w:after="40" w:before="40"/>
+              <w:jc w:val="left"/>
+            </w:pPr>
+            <w:r>
+              <w:rPr>
+                <w:rFonts w:ascii="Times New Roman" w:hAnsi="Times New Roman"/>
+                <w:b w:val="0"/>
+                <w:sz w:val="22"/>
+              </w:rPr>
+              <w:t>Rejected immediately with a message</w:t>
+            </w:r>
+          </w:p>
+        </w:tc>
+      </w:tr>
+      <w:tr>
+        <w:trPr>
+          <w:cantSplit/>
+        </w:trPr>
+        <w:tc>
+          <w:tcPr>
+            <w:tcW w:type="dxa" w:w="2160"/>
+          </w:tcPr>
+          <w:p>
+            <w:pPr>
+              <w:keepNext/>
+              <w:spacing w:after="40" w:before="40"/>
+              <w:jc w:val="left"/>
+            </w:pPr>
+            <w:r>
+              <w:rPr>
+                <w:rFonts w:ascii="Times New Roman" w:hAnsi="Times New Roman"/>
+                <w:b/>
+                <w:sz w:val="22"/>
+              </w:rPr>
+              <w:t>Credit limit</w:t>
+            </w:r>
+          </w:p>
+        </w:tc>
+        <w:tc>
+          <w:tcPr>
+            <w:tcW w:type="dxa" w:w="3456"/>
+          </w:tcPr>
+          <w:p>
+            <w:pPr>
+              <w:keepNext/>
+              <w:spacing w:after="40" w:before="40"/>
+              <w:jc w:val="left"/>
+            </w:pPr>
+            <w:r>
+              <w:rPr>
+                <w:rFonts w:ascii="Times New Roman" w:hAnsi="Times New Roman"/>
+                <w:b w:val="0"/>
+                <w:sz w:val="22"/>
+              </w:rPr>
+              <w:t>Verified manually by the advisor</w:t>
+            </w:r>
+          </w:p>
+        </w:tc>
+        <w:tc>
+          <w:tcPr>
+            <w:tcW w:type="dxa" w:w="3600"/>
+          </w:tcPr>
+          <w:p>
+            <w:pPr>
+              <w:keepNext/>
+              <w:spacing w:after="40" w:before="40"/>
+              <w:jc w:val="left"/>
+            </w:pPr>
+            <w:r>
+              <w:rPr>
+                <w:rFonts w:ascii="Times New Roman" w:hAnsi="Times New Roman"/>
+                <w:b w:val="0"/>
+                <w:sz w:val="22"/>
+              </w:rPr>
+              <w:t>Checked automatically against 24 credits</w:t>
+            </w:r>
+          </w:p>
+        </w:tc>
+      </w:tr>
+      <w:tr>
+        <w:trPr>
+          <w:cantSplit/>
+        </w:trPr>
+        <w:tc>
+          <w:tcPr>
+            <w:tcW w:type="dxa" w:w="2160"/>
+          </w:tcPr>
+          <w:p>
+            <w:pPr>
+              <w:keepNext/>
+              <w:spacing w:after="40" w:before="40"/>
+              <w:jc w:val="left"/>
+            </w:pPr>
+            <w:r>
+              <w:rPr>
+                <w:rFonts w:ascii="Times New Roman" w:hAnsi="Times New Roman"/>
+                <w:b/>
+                <w:sz w:val="22"/>
+              </w:rPr>
+              <w:t>Errors</w:t>
+            </w:r>
+          </w:p>
+        </w:tc>
+        <w:tc>
+          <w:tcPr>
+            <w:tcW w:type="dxa" w:w="3456"/>
+          </w:tcPr>
+          <w:p>
+            <w:pPr>
+              <w:keepNext/>
+              <w:spacing w:after="40" w:before="40"/>
+              <w:jc w:val="left"/>
+            </w:pPr>
+            <w:r>
+              <w:rPr>
+                <w:rFonts w:ascii="Times New Roman" w:hAnsi="Times New Roman"/>
+                <w:b w:val="0"/>
+                <w:sz w:val="22"/>
+              </w:rPr>
+              <w:t>Frequent writing and counting mistakes</w:t>
+            </w:r>
+          </w:p>
+        </w:tc>
+        <w:tc>
+          <w:tcPr>
+            <w:tcW w:type="dxa" w:w="3600"/>
+          </w:tcPr>
+          <w:p>
+            <w:pPr>
+              <w:keepNext/>
+              <w:spacing w:after="40" w:before="40"/>
+              <w:jc w:val="left"/>
+            </w:pPr>
+            <w:r>
+              <w:rPr>
+                <w:rFonts w:ascii="Times New Roman" w:hAnsi="Times New Roman"/>
+                <w:b w:val="0"/>
+                <w:sz w:val="22"/>
+              </w:rPr>
+              <w:t>Rules are enforced by the program</w:t>
+            </w:r>
+          </w:p>
+        </w:tc>
+      </w:tr>
+      <w:tr>
+        <w:trPr>
+          <w:cantSplit/>
+        </w:trPr>
+        <w:tc>
+          <w:tcPr>
+            <w:tcW w:type="dxa" w:w="2160"/>
+          </w:tcPr>
+          <w:p>
+            <w:pPr>
+              <w:spacing w:after="40" w:before="40"/>
+              <w:jc w:val="left"/>
+            </w:pPr>
+            <w:r>
+              <w:rPr>
+                <w:rFonts w:ascii="Times New Roman" w:hAnsi="Times New Roman"/>
+                <w:b/>
+                <w:sz w:val="22"/>
+              </w:rPr>
+              <w:t>Records</w:t>
+            </w:r>
+          </w:p>
+        </w:tc>
+        <w:tc>
+          <w:tcPr>
+            <w:tcW w:type="dxa" w:w="3456"/>
+          </w:tcPr>
+          <w:p>
+            <w:pPr>
+              <w:spacing w:after="40" w:before="40"/>
+              <w:jc w:val="left"/>
+            </w:pPr>
+            <w:r>
+              <w:rPr>
+                <w:rFonts w:ascii="Times New Roman" w:hAnsi="Times New Roman"/>
+                <w:b w:val="0"/>
+                <w:sz w:val="22"/>
+              </w:rPr>
+              <w:t>Paper files that can be lost</w:t>
+            </w:r>
+          </w:p>
+        </w:tc>
+        <w:tc>
+          <w:tcPr>
+            <w:tcW w:type="dxa" w:w="3600"/>
+          </w:tcPr>
+          <w:p>
+            <w:pPr>
+              <w:spacing w:after="40" w:before="40"/>
+              <w:jc w:val="left"/>
+            </w:pPr>
+            <w:r>
+              <w:rPr>
+                <w:rFonts w:ascii="Times New Roman" w:hAnsi="Times New Roman"/>
+                <w:b w:val="0"/>
+                <w:sz w:val="22"/>
+              </w:rPr>
+              <w:t>Saved in the browser and shown instantly</w:t>
+            </w:r>
+          </w:p>
+        </w:tc>
+      </w:tr>
+    </w:tbl>
+    <w:p>
+      <w:pPr>
+        <w:spacing w:after="80" w:before="0" w:line="276" w:lineRule="auto"/>
+        <w:jc w:val="both"/>
+      </w:pPr>
+    </w:p>
+    <w:p>
+      <w:pPr>
+        <w:keepNext/>
+        <w:spacing w:after="80" w:before="120" w:line="276" w:lineRule="auto"/>
+        <w:jc w:val="left"/>
+      </w:pPr>
+      <w:r>
+        <w:rPr>
+          <w:rFonts w:ascii="Times New Roman" w:hAnsi="Times New Roman" w:eastAsia="Times New Roman"/>
+          <w:b/>
+          <w:i w:val="0"/>
+          <w:sz w:val="24"/>
+        </w:rPr>
+        <w:t>1.8 Users of the system</w:t>
+      </w:r>
+    </w:p>
+    <w:tbl>
+      <w:tblPr>
+        <w:tblW w:type="auto" w:w="0"/>
+        <w:tblBorders>
+          <w:top w:val="single" w:sz="6" w:space="0" w:color="000000"/>
+          <w:left w:val="single" w:sz="6" w:space="0" w:color="000000"/>
+          <w:bottom w:val="single" w:sz="6" w:space="0" w:color="000000"/>
+          <w:right w:val="single" w:sz="6" w:space="0" w:color="000000"/>
+          <w:insideH w:val="single" w:sz="6" w:space="0" w:color="000000"/>
+          <w:insideV w:val="single" w:sz="6" w:space="0" w:color="000000"/>
+        </w:tblBorders>
+        <w:tblLayout w:type="fixed"/>
+        <w:tblLook w:firstColumn="1" w:firstRow="1" w:lastColumn="0" w:lastRow="0" w:noHBand="0" w:noVBand="1" w:val="04A0"/>
+      </w:tblPr>
+      <w:tblGrid>
+        <w:gridCol w:w="2160"/>
+        <w:gridCol w:w="4896"/>
+        <w:gridCol w:w="2160"/>
+      </w:tblGrid>
+      <w:tr>
+        <w:trPr>
+          <w:tblHeader/>
+          <w:cantSplit/>
+        </w:trPr>
+        <w:tc>
+          <w:tcPr>
+            <w:tcW w:type="dxa" w:w="2160"/>
+            <w:shd w:val="clear" w:color="auto" w:fill="D9E2D5"/>
+          </w:tcPr>
+          <w:p>
+            <w:pPr>
+              <w:keepNext/>
+              <w:spacing w:after="40" w:before="40"/>
+              <w:jc w:val="center"/>
+            </w:pPr>
+            <w:r>
+              <w:rPr>
+                <w:rFonts w:ascii="Times New Roman" w:hAnsi="Times New Roman"/>
+                <w:b/>
+                <w:sz w:val="22"/>
+              </w:rPr>
+              <w:t>User</w:t>
+            </w:r>
+          </w:p>
+        </w:tc>
+        <w:tc>
+          <w:tcPr>
+            <w:tcW w:type="dxa" w:w="4896"/>
+            <w:shd w:val="clear" w:color="auto" w:fill="D9E2D5"/>
+          </w:tcPr>
+          <w:p>
+            <w:pPr>
+              <w:keepNext/>
+              <w:spacing w:after="40" w:before="40"/>
+              <w:jc w:val="center"/>
+            </w:pPr>
+            <w:r>
+              <w:rPr>
+                <w:rFonts w:ascii="Times New Roman" w:hAnsi="Times New Roman"/>
+                <w:b/>
+                <w:sz w:val="22"/>
+              </w:rPr>
+              <w:t>Role</w:t>
+            </w:r>
+          </w:p>
+        </w:tc>
+        <w:tc>
+          <w:tcPr>
+            <w:tcW w:type="dxa" w:w="2160"/>
+            <w:shd w:val="clear" w:color="auto" w:fill="D9E2D5"/>
+          </w:tcPr>
+          <w:p>
+            <w:pPr>
+              <w:keepNext/>
+              <w:spacing w:after="40" w:before="40"/>
+              <w:jc w:val="center"/>
+            </w:pPr>
+            <w:r>
+              <w:rPr>
+                <w:rFonts w:ascii="Times New Roman" w:hAnsi="Times New Roman"/>
+                <w:b/>
+                <w:sz w:val="22"/>
+              </w:rPr>
+              <w:t>Status in this project</w:t>
+            </w:r>
+          </w:p>
+        </w:tc>
+      </w:tr>
+      <w:tr>
+        <w:trPr>
+          <w:cantSplit/>
+        </w:trPr>
+        <w:tc>
+          <w:tcPr>
+            <w:tcW w:type="dxa" w:w="2160"/>
+          </w:tcPr>
+          <w:p>
+            <w:pPr>
+              <w:keepNext/>
+              <w:spacing w:after="40" w:before="40"/>
+              <w:jc w:val="left"/>
+            </w:pPr>
+            <w:r>
+              <w:rPr>
+                <w:rFonts w:ascii="Times New Roman" w:hAnsi="Times New Roman"/>
+                <w:b/>
+                <w:sz w:val="22"/>
+              </w:rPr>
+              <w:t>Student</w:t>
+            </w:r>
+          </w:p>
+        </w:tc>
+        <w:tc>
+          <w:tcPr>
+            <w:tcW w:type="dxa" w:w="4896"/>
+          </w:tcPr>
+          <w:p>
+            <w:pPr>
+              <w:keepNext/>
+              <w:spacing w:after="40" w:before="40"/>
+              <w:jc w:val="left"/>
+            </w:pPr>
+            <w:r>
+              <w:rPr>
+                <w:rFonts w:ascii="Times New Roman" w:hAnsi="Times New Roman"/>
+                <w:b w:val="0"/>
+                <w:sz w:val="22"/>
+              </w:rPr>
+              <w:t>Logs in, searches courses, registers, drops and views the timetable</w:t>
+            </w:r>
+          </w:p>
+        </w:tc>
+        <w:tc>
+          <w:tcPr>
+            <w:tcW w:type="dxa" w:w="2160"/>
+          </w:tcPr>
+          <w:p>
+            <w:pPr>
+              <w:keepNext/>
+              <w:spacing w:after="40" w:before="40"/>
+              <w:jc w:val="left"/>
+            </w:pPr>
+            <w:r>
+              <w:rPr>
+                <w:rFonts w:ascii="Times New Roman" w:hAnsi="Times New Roman"/>
+                <w:b w:val="0"/>
+                <w:sz w:val="22"/>
+              </w:rPr>
+              <w:t>Implemented</w:t>
+            </w:r>
+          </w:p>
+        </w:tc>
+      </w:tr>
+      <w:tr>
+        <w:trPr>
+          <w:cantSplit/>
+        </w:trPr>
+        <w:tc>
+          <w:tcPr>
+            <w:tcW w:type="dxa" w:w="2160"/>
+          </w:tcPr>
+          <w:p>
+            <w:pPr>
+              <w:keepNext/>
+              <w:spacing w:after="40" w:before="40"/>
+              <w:jc w:val="left"/>
+            </w:pPr>
+            <w:r>
+              <w:rPr>
+                <w:rFonts w:ascii="Times New Roman" w:hAnsi="Times New Roman"/>
+                <w:b/>
+                <w:sz w:val="22"/>
+              </w:rPr>
+              <w:t>Faculty advisor</w:t>
+            </w:r>
+          </w:p>
+        </w:tc>
+        <w:tc>
+          <w:tcPr>
+            <w:tcW w:type="dxa" w:w="4896"/>
+          </w:tcPr>
+          <w:p>
+            <w:pPr>
+              <w:keepNext/>
+              <w:spacing w:after="40" w:before="40"/>
+              <w:jc w:val="left"/>
+            </w:pPr>
+            <w:r>
+              <w:rPr>
+                <w:rFonts w:ascii="Times New Roman" w:hAnsi="Times New Roman"/>
+                <w:b w:val="0"/>
+                <w:sz w:val="22"/>
+              </w:rPr>
+              <w:t>Approves the registrations of the students</w:t>
+            </w:r>
+          </w:p>
+        </w:tc>
+        <w:tc>
+          <w:tcPr>
+            <w:tcW w:type="dxa" w:w="2160"/>
+          </w:tcPr>
+          <w:p>
+            <w:pPr>
+              <w:keepNext/>
+              <w:spacing w:after="40" w:before="40"/>
+              <w:jc w:val="left"/>
+            </w:pPr>
+            <w:r>
+              <w:rPr>
+                <w:rFonts w:ascii="Times New Roman" w:hAnsi="Times New Roman"/>
+                <w:b w:val="0"/>
+                <w:sz w:val="22"/>
+              </w:rPr>
+              <w:t>Future enhancement</w:t>
+            </w:r>
+          </w:p>
+        </w:tc>
+      </w:tr>
+      <w:tr>
+        <w:trPr>
+          <w:cantSplit/>
+        </w:trPr>
+        <w:tc>
+          <w:tcPr>
+            <w:tcW w:type="dxa" w:w="2160"/>
+          </w:tcPr>
+          <w:p>
+            <w:pPr>
+              <w:spacing w:after="40" w:before="40"/>
+              <w:jc w:val="left"/>
+            </w:pPr>
+            <w:r>
+              <w:rPr>
+                <w:rFonts w:ascii="Times New Roman" w:hAnsi="Times New Roman"/>
+                <w:b/>
+                <w:sz w:val="22"/>
+              </w:rPr>
+              <w:t>Administrator</w:t>
+            </w:r>
+          </w:p>
+        </w:tc>
+        <w:tc>
+          <w:tcPr>
+            <w:tcW w:type="dxa" w:w="4896"/>
+          </w:tcPr>
+          <w:p>
+            <w:pPr>
+              <w:spacing w:after="40" w:before="40"/>
+              <w:jc w:val="left"/>
+            </w:pPr>
+            <w:r>
+              <w:rPr>
+                <w:rFonts w:ascii="Times New Roman" w:hAnsi="Times New Roman"/>
+                <w:b w:val="0"/>
+                <w:sz w:val="22"/>
+              </w:rPr>
+              <w:t>Creates courses, sets seats and slots</w:t>
+            </w:r>
+          </w:p>
+        </w:tc>
+        <w:tc>
+          <w:tcPr>
+            <w:tcW w:type="dxa" w:w="2160"/>
+          </w:tcPr>
+          <w:p>
+            <w:pPr>
+              <w:spacing w:after="40" w:before="40"/>
+              <w:jc w:val="left"/>
+            </w:pPr>
+            <w:r>
+              <w:rPr>
+                <w:rFonts w:ascii="Times New Roman" w:hAnsi="Times New Roman"/>
+                <w:b w:val="0"/>
+                <w:sz w:val="22"/>
+              </w:rPr>
+              <w:t>Future enhancement</w:t>
+            </w:r>
+          </w:p>
+        </w:tc>
+      </w:tr>
+    </w:tbl>
+    <w:p>
+      <w:pPr>
+        <w:spacing w:after="80" w:before="0" w:line="276" w:lineRule="auto"/>
+        <w:jc w:val="both"/>
+      </w:pPr>
+    </w:p>
+    <w:p>
+      <w:pPr>
+        <w:keepNext/>
+        <w:spacing w:after="80" w:before="120" w:line="276" w:lineRule="auto"/>
+        <w:jc w:val="left"/>
+      </w:pPr>
+      <w:r>
+        <w:rPr>
+          <w:rFonts w:ascii="Times New Roman" w:hAnsi="Times New Roman" w:eastAsia="Times New Roman"/>
+          <w:b/>
+          <w:i w:val="0"/>
+          <w:sz w:val="24"/>
+        </w:rPr>
+        <w:t>1.9 Software requirements</w:t>
+      </w:r>
+    </w:p>
+    <w:tbl>
+      <w:tblPr>
+        <w:tblW w:type="auto" w:w="0"/>
+        <w:tblBorders>
+          <w:top w:val="single" w:sz="6" w:space="0" w:color="000000"/>
+          <w:left w:val="single" w:sz="6" w:space="0" w:color="000000"/>
+          <w:bottom w:val="single" w:sz="6" w:space="0" w:color="000000"/>
+          <w:right w:val="single" w:sz="6" w:space="0" w:color="000000"/>
+          <w:insideH w:val="single" w:sz="6" w:space="0" w:color="000000"/>
+          <w:insideV w:val="single" w:sz="6" w:space="0" w:color="000000"/>
+        </w:tblBorders>
+        <w:tblLayout w:type="fixed"/>
+        <w:tblLook w:firstColumn="1" w:firstRow="1" w:lastColumn="0" w:lastRow="0" w:noHBand="0" w:noVBand="1" w:val="04A0"/>
+      </w:tblPr>
+      <w:tblGrid>
+        <w:gridCol w:w="2880"/>
+        <w:gridCol w:w="6336"/>
+      </w:tblGrid>
+      <w:tr>
+        <w:trPr>
+          <w:tblHeader/>
+          <w:cantSplit/>
+        </w:trPr>
+        <w:tc>
+          <w:tcPr>
+            <w:tcW w:type="dxa" w:w="2880"/>
+            <w:shd w:val="clear" w:color="auto" w:fill="D9E2D5"/>
+          </w:tcPr>
+          <w:p>
+            <w:pPr>
+              <w:keepNext/>
+              <w:spacing w:after="40" w:before="40"/>
+              <w:jc w:val="center"/>
+            </w:pPr>
+            <w:r>
+              <w:rPr>
+                <w:rFonts w:ascii="Times New Roman" w:hAnsi="Times New Roman"/>
+                <w:b/>
+                <w:sz w:val="22"/>
+              </w:rPr>
+              <w:t>Item</w:t>
+            </w:r>
+          </w:p>
+        </w:tc>
+        <w:tc>
+          <w:tcPr>
+            <w:tcW w:type="dxa" w:w="6336"/>
+            <w:shd w:val="clear" w:color="auto" w:fill="D9E2D5"/>
+          </w:tcPr>
+          <w:p>
+            <w:pPr>
+              <w:keepNext/>
+              <w:spacing w:after="40" w:before="40"/>
+              <w:jc w:val="center"/>
+            </w:pPr>
+            <w:r>
+              <w:rPr>
+                <w:rFonts w:ascii="Times New Roman" w:hAnsi="Times New Roman"/>
+                <w:b/>
+                <w:sz w:val="22"/>
+              </w:rPr>
+              <w:t>Requirement</w:t>
+            </w:r>
+          </w:p>
+        </w:tc>
+      </w:tr>
+      <w:tr>
+        <w:trPr>
+          <w:cantSplit/>
+        </w:trPr>
+        <w:tc>
+          <w:tcPr>
+            <w:tcW w:type="dxa" w:w="2880"/>
+          </w:tcPr>
+          <w:p>
+            <w:pPr>
+              <w:keepNext/>
+              <w:spacing w:after="40" w:before="40"/>
+              <w:jc w:val="left"/>
+            </w:pPr>
+            <w:r>
+              <w:rPr>
+                <w:rFonts w:ascii="Times New Roman" w:hAnsi="Times New Roman"/>
+                <w:b/>
+                <w:sz w:val="22"/>
+              </w:rPr>
+              <w:t>Operating system</w:t>
+            </w:r>
+          </w:p>
+        </w:tc>
+        <w:tc>
+          <w:tcPr>
+            <w:tcW w:type="dxa" w:w="6336"/>
+          </w:tcPr>
+          <w:p>
+            <w:pPr>
+              <w:keepNext/>
+              <w:spacing w:after="40" w:before="40"/>
+              <w:jc w:val="left"/>
+            </w:pPr>
+            <w:r>
+              <w:rPr>
+                <w:rFonts w:ascii="Times New Roman" w:hAnsi="Times New Roman"/>
+                <w:b w:val="0"/>
+                <w:sz w:val="22"/>
+              </w:rPr>
+              <w:t>Windows 10 / Linux / macOS</w:t>
+            </w:r>
+          </w:p>
+        </w:tc>
+      </w:tr>
+      <w:tr>
+        <w:trPr>
+          <w:cantSplit/>
+        </w:trPr>
+        <w:tc>
+          <w:tcPr>
+            <w:tcW w:type="dxa" w:w="2880"/>
+          </w:tcPr>
+          <w:p>
+            <w:pPr>
+              <w:keepNext/>
+              <w:spacing w:after="40" w:before="40"/>
+              <w:jc w:val="left"/>
+            </w:pPr>
+            <w:r>
+              <w:rPr>
+                <w:rFonts w:ascii="Times New Roman" w:hAnsi="Times New Roman"/>
+                <w:b/>
+                <w:sz w:val="22"/>
+              </w:rPr>
+              <w:t>Web browser</w:t>
+            </w:r>
+          </w:p>
+        </w:tc>
+        <w:tc>
+          <w:tcPr>
+            <w:tcW w:type="dxa" w:w="6336"/>
+          </w:tcPr>
+          <w:p>
+            <w:pPr>
+              <w:keepNext/>
+              <w:spacing w:after="40" w:before="40"/>
+              <w:jc w:val="left"/>
+            </w:pPr>
+            <w:r>
+              <w:rPr>
+                <w:rFonts w:ascii="Times New Roman" w:hAnsi="Times New Roman"/>
+                <w:b w:val="0"/>
+                <w:sz w:val="22"/>
+              </w:rPr>
+              <w:t>Google Chrome, Microsoft Edge, Mozilla Firefox or Safari (latest version)</w:t>
+            </w:r>
+          </w:p>
+        </w:tc>
+      </w:tr>
+      <w:tr>
+        <w:trPr>
+          <w:cantSplit/>
+        </w:trPr>
+        <w:tc>
+          <w:tcPr>
+            <w:tcW w:type="dxa" w:w="2880"/>
+          </w:tcPr>
+          <w:p>
+            <w:pPr>
+              <w:keepNext/>
+              <w:spacing w:after="40" w:before="40"/>
+              <w:jc w:val="left"/>
+            </w:pPr>
+            <w:r>
+              <w:rPr>
+                <w:rFonts w:ascii="Times New Roman" w:hAnsi="Times New Roman"/>
+                <w:b/>
+                <w:sz w:val="22"/>
+              </w:rPr>
+              <w:t>Editor</w:t>
+            </w:r>
+          </w:p>
+        </w:tc>
+        <w:tc>
+          <w:tcPr>
+            <w:tcW w:type="dxa" w:w="6336"/>
+          </w:tcPr>
+          <w:p>
+            <w:pPr>
+              <w:keepNext/>
+              <w:spacing w:after="40" w:before="40"/>
+              <w:jc w:val="left"/>
+            </w:pPr>
+            <w:r>
+              <w:rPr>
+                <w:rFonts w:ascii="Times New Roman" w:hAnsi="Times New Roman"/>
+                <w:b w:val="0"/>
+                <w:sz w:val="22"/>
+              </w:rPr>
+              <w:t>Visual Studio Code or any text editor</w:t>
+            </w:r>
+          </w:p>
+        </w:tc>
+      </w:tr>
+      <w:tr>
+        <w:trPr>
+          <w:cantSplit/>
+        </w:trPr>
+        <w:tc>
+          <w:tcPr>
+            <w:tcW w:type="dxa" w:w="2880"/>
+          </w:tcPr>
+          <w:p>
+            <w:pPr>
+              <w:spacing w:after="40" w:before="40"/>
+              <w:jc w:val="left"/>
+            </w:pPr>
+            <w:r>
+              <w:rPr>
+                <w:rFonts w:ascii="Times New Roman" w:hAnsi="Times New Roman"/>
+                <w:b/>
+                <w:sz w:val="22"/>
+              </w:rPr>
+              <w:t>Internet</w:t>
+            </w:r>
+          </w:p>
+        </w:tc>
+        <w:tc>
+          <w:tcPr>
+            <w:tcW w:type="dxa" w:w="6336"/>
+          </w:tcPr>
+          <w:p>
+            <w:pPr>
+              <w:spacing w:after="40" w:before="40"/>
+              <w:jc w:val="left"/>
+            </w:pPr>
+            <w:r>
+              <w:rPr>
+                <w:rFonts w:ascii="Times New Roman" w:hAnsi="Times New Roman"/>
+                <w:b w:val="0"/>
+                <w:sz w:val="22"/>
+              </w:rPr>
+              <w:t>Not needed to run the application (static files only)</w:t>
+            </w:r>
+          </w:p>
+        </w:tc>
+      </w:tr>
+    </w:tbl>
+    <w:p>
+      <w:pPr>
+        <w:spacing w:after="80" w:before="0" w:line="276" w:lineRule="auto"/>
+        <w:jc w:val="both"/>
+      </w:pPr>
+    </w:p>
+    <w:p>
+      <w:pPr>
+        <w:keepNext/>
+        <w:spacing w:after="80" w:before="120" w:line="276" w:lineRule="auto"/>
+        <w:jc w:val="left"/>
+      </w:pPr>
+      <w:r>
+        <w:rPr>
+          <w:rFonts w:ascii="Times New Roman" w:hAnsi="Times New Roman" w:eastAsia="Times New Roman"/>
+          <w:b/>
+          <w:i w:val="0"/>
+          <w:sz w:val="24"/>
+        </w:rPr>
+        <w:t>1.10 Applications</w:t>
+      </w:r>
+    </w:p>
+    <w:p>
+      <w:pPr>
+        <w:spacing w:after="80" w:before="0" w:line="276" w:lineRule="auto"/>
+        <w:ind w:left="432" w:hanging="288"/>
+        <w:jc w:val="both"/>
+      </w:pPr>
+      <w:r>
+        <w:rPr>
+          <w:rFonts w:ascii="Times New Roman" w:hAnsi="Times New Roman"/>
+          <w:b w:val="0"/>
+          <w:sz w:val="24"/>
+        </w:rPr>
+        <w:t xml:space="preserve">•  </w:t>
+      </w:r>
+      <w:r>
+        <w:rPr>
+          <w:rFonts w:ascii="Times New Roman" w:hAnsi="Times New Roman"/>
+          <w:b w:val="0"/>
+          <w:sz w:val="24"/>
+        </w:rPr>
+        <w:t>Semester course registration in engineering and arts colleges.</w:t>
+      </w:r>
+    </w:p>
+    <w:p>
+      <w:pPr>
+        <w:spacing w:after="80" w:before="0" w:line="276" w:lineRule="auto"/>
+        <w:ind w:left="432" w:hanging="288"/>
+        <w:jc w:val="both"/>
+      </w:pPr>
+      <w:r>
+        <w:rPr>
+          <w:rFonts w:ascii="Times New Roman" w:hAnsi="Times New Roman"/>
+          <w:b w:val="0"/>
+          <w:sz w:val="24"/>
+        </w:rPr>
+        <w:t xml:space="preserve">•  </w:t>
+      </w:r>
+      <w:r>
+        <w:rPr>
+          <w:rFonts w:ascii="Times New Roman" w:hAnsi="Times New Roman"/>
+          <w:b w:val="0"/>
+          <w:sz w:val="24"/>
+        </w:rPr>
+        <w:t>Elective selection and add / drop process at the beginning of a semester.</w:t>
+      </w:r>
+    </w:p>
+    <w:p>
+      <w:pPr>
+        <w:spacing w:after="80" w:before="0" w:line="276" w:lineRule="auto"/>
+        <w:ind w:left="432" w:hanging="288"/>
+        <w:jc w:val="both"/>
+      </w:pPr>
+      <w:r>
+        <w:rPr>
+          <w:rFonts w:ascii="Times New Roman" w:hAnsi="Times New Roman"/>
+          <w:b w:val="0"/>
+          <w:sz w:val="24"/>
+        </w:rPr>
+        <w:t xml:space="preserve">•  </w:t>
+      </w:r>
+      <w:r>
+        <w:rPr>
+          <w:rFonts w:ascii="Times New Roman" w:hAnsi="Times New Roman"/>
+          <w:b w:val="0"/>
+          <w:sz w:val="24"/>
+        </w:rPr>
+        <w:t>Online training centres and certificate programmes with limited batch sizes.</w:t>
+      </w:r>
+    </w:p>
+    <w:p>
+      <w:pPr>
+        <w:keepNext/>
+        <w:spacing w:after="80" w:before="120" w:line="276" w:lineRule="auto"/>
+        <w:jc w:val="left"/>
+      </w:pPr>
+      <w:r>
+        <w:rPr>
+          <w:rFonts w:ascii="Times New Roman" w:hAnsi="Times New Roman" w:eastAsia="Times New Roman"/>
+          <w:b/>
+          <w:i w:val="0"/>
+          <w:sz w:val="24"/>
+        </w:rPr>
+        <w:t>1.11 Limitations</w:t>
+      </w:r>
+    </w:p>
+    <w:p>
+      <w:pPr>
+        <w:spacing w:after="80" w:before="0" w:line="276" w:lineRule="auto"/>
+        <w:ind w:left="432" w:hanging="288"/>
+        <w:jc w:val="both"/>
+      </w:pPr>
+      <w:r>
+        <w:rPr>
+          <w:rFonts w:ascii="Times New Roman" w:hAnsi="Times New Roman"/>
+          <w:b w:val="0"/>
+          <w:sz w:val="24"/>
+        </w:rPr>
+        <w:t xml:space="preserve">•  </w:t>
+      </w:r>
+      <w:r>
+        <w:rPr>
+          <w:rFonts w:ascii="Times New Roman" w:hAnsi="Times New Roman"/>
+          <w:b w:val="0"/>
+          <w:sz w:val="24"/>
+        </w:rPr>
+        <w:t>The data is stored in the browser of one computer, so it is not shared between different computers.</w:t>
+      </w:r>
+    </w:p>
+    <w:p>
+      <w:pPr>
+        <w:spacing w:after="80" w:before="0" w:line="276" w:lineRule="auto"/>
+        <w:ind w:left="432" w:hanging="288"/>
+        <w:jc w:val="both"/>
+      </w:pPr>
+      <w:r>
+        <w:rPr>
+          <w:rFonts w:ascii="Times New Roman" w:hAnsi="Times New Roman"/>
+          <w:b w:val="0"/>
+          <w:sz w:val="24"/>
+        </w:rPr>
+        <w:t xml:space="preserve">•  </w:t>
+      </w:r>
+      <w:r>
+        <w:rPr>
+          <w:rFonts w:ascii="Times New Roman" w:hAnsi="Times New Roman"/>
+          <w:b w:val="0"/>
+          <w:sz w:val="24"/>
+        </w:rPr>
+        <w:t>There is no real authentication server; the student list and password are kept in the script for demonstration.</w:t>
+      </w:r>
+    </w:p>
+    <w:p>
+      <w:pPr>
+        <w:spacing w:after="80" w:before="0" w:line="276" w:lineRule="auto"/>
+        <w:ind w:left="432" w:hanging="288"/>
+        <w:jc w:val="both"/>
+      </w:pPr>
+      <w:r>
+        <w:rPr>
+          <w:rFonts w:ascii="Times New Roman" w:hAnsi="Times New Roman"/>
+          <w:b w:val="0"/>
+          <w:sz w:val="24"/>
+        </w:rPr>
+        <w:t xml:space="preserve">•  </w:t>
+      </w:r>
+      <w:r>
+        <w:rPr>
+          <w:rFonts w:ascii="Times New Roman" w:hAnsi="Times New Roman"/>
+          <w:b w:val="0"/>
+          <w:sz w:val="24"/>
+        </w:rPr>
+        <w:t>Only student functions are implemented; faculty and administrator functions are future work.</w:t>
+      </w:r>
+    </w:p>
+    <w:p>
+      <w:pPr>
+        <w:keepNext/>
+        <w:pageBreakBefore/>
         <w:pBdr>
           <w:bottom w:val="single" w:sz="8" w:space="1" w:color="000000"/>
         </w:pBdr>
@@ -5180,7 +6420,7 @@
       <w:r>
         <w:drawing>
           <wp:inline xmlns:a="http://schemas.openxmlformats.org/drawingml/2006/main" xmlns:pic="http://schemas.openxmlformats.org/drawingml/2006/picture">
-            <wp:extent cx="3840480" cy="4636117"/>
+            <wp:extent cx="3474720" cy="4194582"/>
             <wp:docPr id="1" name="Picture 1"/>
             <wp:cNvGraphicFramePr>
               <a:graphicFrameLocks noChangeAspect="1"/>
@@ -5201,7 +6441,7 @@
                   <pic:spPr>
                     <a:xfrm>
                       <a:off x="0" y="0"/>
-                      <a:ext cx="3840480" cy="4636117"/>
+                      <a:ext cx="3474720" cy="4194582"/>
                     </a:xfrm>
                     <a:prstGeom prst="rect"/>
                   </pic:spPr>
@@ -5261,6 +6501,505 @@
     <w:p>
       <w:pPr>
         <w:keepNext/>
+        <w:spacing w:after="80" w:before="120" w:line="276" w:lineRule="auto"/>
+        <w:jc w:val="left"/>
+      </w:pPr>
+      <w:r>
+        <w:rPr>
+          <w:rFonts w:ascii="Times New Roman" w:hAnsi="Times New Roman" w:eastAsia="Times New Roman"/>
+          <w:b/>
+          <w:i w:val="0"/>
+          <w:sz w:val="24"/>
+        </w:rPr>
+        <w:t>2.7 Example walk-through of the logic</w:t>
+      </w:r>
+    </w:p>
+    <w:tbl>
+      <w:tblPr>
+        <w:tblW w:type="auto" w:w="0"/>
+        <w:tblBorders>
+          <w:top w:val="single" w:sz="6" w:space="0" w:color="000000"/>
+          <w:left w:val="single" w:sz="6" w:space="0" w:color="000000"/>
+          <w:bottom w:val="single" w:sz="6" w:space="0" w:color="000000"/>
+          <w:right w:val="single" w:sz="6" w:space="0" w:color="000000"/>
+          <w:insideH w:val="single" w:sz="6" w:space="0" w:color="000000"/>
+          <w:insideV w:val="single" w:sz="6" w:space="0" w:color="000000"/>
+        </w:tblBorders>
+        <w:tblLayout w:type="fixed"/>
+        <w:tblLook w:firstColumn="1" w:firstRow="1" w:lastColumn="0" w:lastRow="0" w:noHBand="0" w:noVBand="1" w:val="04A0"/>
+      </w:tblPr>
+      <w:tblGrid>
+        <w:gridCol w:w="3744"/>
+        <w:gridCol w:w="3312"/>
+        <w:gridCol w:w="2160"/>
+      </w:tblGrid>
+      <w:tr>
+        <w:trPr>
+          <w:tblHeader/>
+          <w:cantSplit/>
+        </w:trPr>
+        <w:tc>
+          <w:tcPr>
+            <w:tcW w:type="dxa" w:w="3744"/>
+            <w:shd w:val="clear" w:color="auto" w:fill="D9E2D5"/>
+          </w:tcPr>
+          <w:p>
+            <w:pPr>
+              <w:keepNext/>
+              <w:spacing w:after="40" w:before="40"/>
+              <w:jc w:val="center"/>
+            </w:pPr>
+            <w:r>
+              <w:rPr>
+                <w:rFonts w:ascii="Times New Roman" w:hAnsi="Times New Roman"/>
+                <w:b/>
+                <w:sz w:val="20"/>
+              </w:rPr>
+              <w:t>Action of student 71812401006</w:t>
+            </w:r>
+          </w:p>
+        </w:tc>
+        <w:tc>
+          <w:tcPr>
+            <w:tcW w:type="dxa" w:w="3312"/>
+            <w:shd w:val="clear" w:color="auto" w:fill="D9E2D5"/>
+          </w:tcPr>
+          <w:p>
+            <w:pPr>
+              <w:keepNext/>
+              <w:spacing w:after="40" w:before="40"/>
+              <w:jc w:val="center"/>
+            </w:pPr>
+            <w:r>
+              <w:rPr>
+                <w:rFonts w:ascii="Times New Roman" w:hAnsi="Times New Roman"/>
+                <w:b/>
+                <w:sz w:val="20"/>
+              </w:rPr>
+              <w:t>Rule checked</w:t>
+            </w:r>
+          </w:p>
+        </w:tc>
+        <w:tc>
+          <w:tcPr>
+            <w:tcW w:type="dxa" w:w="2160"/>
+            <w:shd w:val="clear" w:color="auto" w:fill="D9E2D5"/>
+          </w:tcPr>
+          <w:p>
+            <w:pPr>
+              <w:keepNext/>
+              <w:spacing w:after="40" w:before="40"/>
+              <w:jc w:val="center"/>
+            </w:pPr>
+            <w:r>
+              <w:rPr>
+                <w:rFonts w:ascii="Times New Roman" w:hAnsi="Times New Roman"/>
+                <w:b/>
+                <w:sz w:val="20"/>
+              </w:rPr>
+              <w:t>Result</w:t>
+            </w:r>
+          </w:p>
+        </w:tc>
+      </w:tr>
+      <w:tr>
+        <w:trPr>
+          <w:cantSplit/>
+        </w:trPr>
+        <w:tc>
+          <w:tcPr>
+            <w:tcW w:type="dxa" w:w="3744"/>
+          </w:tcPr>
+          <w:p>
+            <w:pPr>
+              <w:keepNext/>
+              <w:spacing w:after="40" w:before="40"/>
+              <w:jc w:val="left"/>
+            </w:pPr>
+            <w:r>
+              <w:rPr>
+                <w:rFonts w:ascii="Times New Roman" w:hAnsi="Times New Roman"/>
+                <w:b/>
+                <w:sz w:val="20"/>
+              </w:rPr>
+              <w:t>Register 20CS212 (3 credits, Mon-1, Wed-2)</w:t>
+            </w:r>
+          </w:p>
+        </w:tc>
+        <w:tc>
+          <w:tcPr>
+            <w:tcW w:type="dxa" w:w="3312"/>
+          </w:tcPr>
+          <w:p>
+            <w:pPr>
+              <w:keepNext/>
+              <w:spacing w:after="40" w:before="40"/>
+              <w:jc w:val="left"/>
+            </w:pPr>
+            <w:r>
+              <w:rPr>
+                <w:rFonts w:ascii="Times New Roman" w:hAnsi="Times New Roman"/>
+                <w:b w:val="0"/>
+                <w:sz w:val="20"/>
+              </w:rPr>
+              <w:t>Seats, credits 3 &lt;= 24, no clash</w:t>
+            </w:r>
+          </w:p>
+        </w:tc>
+        <w:tc>
+          <w:tcPr>
+            <w:tcW w:type="dxa" w:w="2160"/>
+          </w:tcPr>
+          <w:p>
+            <w:pPr>
+              <w:keepNext/>
+              <w:spacing w:after="40" w:before="40"/>
+              <w:jc w:val="left"/>
+            </w:pPr>
+            <w:r>
+              <w:rPr>
+                <w:rFonts w:ascii="Times New Roman" w:hAnsi="Times New Roman"/>
+                <w:b w:val="0"/>
+                <w:sz w:val="20"/>
+              </w:rPr>
+              <w:t>Registered; credits 3 / 24</w:t>
+            </w:r>
+          </w:p>
+        </w:tc>
+      </w:tr>
+      <w:tr>
+        <w:trPr>
+          <w:cantSplit/>
+        </w:trPr>
+        <w:tc>
+          <w:tcPr>
+            <w:tcW w:type="dxa" w:w="3744"/>
+          </w:tcPr>
+          <w:p>
+            <w:pPr>
+              <w:keepNext/>
+              <w:spacing w:after="40" w:before="40"/>
+              <w:jc w:val="left"/>
+            </w:pPr>
+            <w:r>
+              <w:rPr>
+                <w:rFonts w:ascii="Times New Roman" w:hAnsi="Times New Roman"/>
+                <w:b/>
+                <w:sz w:val="20"/>
+              </w:rPr>
+              <w:t>Register 20CS202 (3 credits, Mon-3, Fri-2)</w:t>
+            </w:r>
+          </w:p>
+        </w:tc>
+        <w:tc>
+          <w:tcPr>
+            <w:tcW w:type="dxa" w:w="3312"/>
+          </w:tcPr>
+          <w:p>
+            <w:pPr>
+              <w:keepNext/>
+              <w:spacing w:after="40" w:before="40"/>
+              <w:jc w:val="left"/>
+            </w:pPr>
+            <w:r>
+              <w:rPr>
+                <w:rFonts w:ascii="Times New Roman" w:hAnsi="Times New Roman"/>
+                <w:b w:val="0"/>
+                <w:sz w:val="20"/>
+              </w:rPr>
+              <w:t>Seats, credits 6 &lt;= 24, no clash</w:t>
+            </w:r>
+          </w:p>
+        </w:tc>
+        <w:tc>
+          <w:tcPr>
+            <w:tcW w:type="dxa" w:w="2160"/>
+          </w:tcPr>
+          <w:p>
+            <w:pPr>
+              <w:keepNext/>
+              <w:spacing w:after="40" w:before="40"/>
+              <w:jc w:val="left"/>
+            </w:pPr>
+            <w:r>
+              <w:rPr>
+                <w:rFonts w:ascii="Times New Roman" w:hAnsi="Times New Roman"/>
+                <w:b w:val="0"/>
+                <w:sz w:val="20"/>
+              </w:rPr>
+              <w:t>Registered; credits 6 / 24</w:t>
+            </w:r>
+          </w:p>
+        </w:tc>
+      </w:tr>
+      <w:tr>
+        <w:trPr>
+          <w:cantSplit/>
+        </w:trPr>
+        <w:tc>
+          <w:tcPr>
+            <w:tcW w:type="dxa" w:w="3744"/>
+          </w:tcPr>
+          <w:p>
+            <w:pPr>
+              <w:keepNext/>
+              <w:spacing w:after="40" w:before="40"/>
+              <w:jc w:val="left"/>
+            </w:pPr>
+            <w:r>
+              <w:rPr>
+                <w:rFonts w:ascii="Times New Roman" w:hAnsi="Times New Roman"/>
+                <w:b/>
+                <w:sz w:val="20"/>
+              </w:rPr>
+              <w:t>Register 20CS204 (Mon-1, Thu-3)</w:t>
+            </w:r>
+          </w:p>
+        </w:tc>
+        <w:tc>
+          <w:tcPr>
+            <w:tcW w:type="dxa" w:w="3312"/>
+          </w:tcPr>
+          <w:p>
+            <w:pPr>
+              <w:keepNext/>
+              <w:spacing w:after="40" w:before="40"/>
+              <w:jc w:val="left"/>
+            </w:pPr>
+            <w:r>
+              <w:rPr>
+                <w:rFonts w:ascii="Times New Roman" w:hAnsi="Times New Roman"/>
+                <w:b w:val="0"/>
+                <w:sz w:val="20"/>
+              </w:rPr>
+              <w:t>Slot Mon-1 already used by 20CS212</w:t>
+            </w:r>
+          </w:p>
+        </w:tc>
+        <w:tc>
+          <w:tcPr>
+            <w:tcW w:type="dxa" w:w="2160"/>
+          </w:tcPr>
+          <w:p>
+            <w:pPr>
+              <w:keepNext/>
+              <w:spacing w:after="40" w:before="40"/>
+              <w:jc w:val="left"/>
+            </w:pPr>
+            <w:r>
+              <w:rPr>
+                <w:rFonts w:ascii="Times New Roman" w:hAnsi="Times New Roman"/>
+                <w:b w:val="0"/>
+                <w:sz w:val="20"/>
+              </w:rPr>
+              <w:t>Rejected: time clash</w:t>
+            </w:r>
+          </w:p>
+        </w:tc>
+      </w:tr>
+      <w:tr>
+        <w:trPr>
+          <w:cantSplit/>
+        </w:trPr>
+        <w:tc>
+          <w:tcPr>
+            <w:tcW w:type="dxa" w:w="3744"/>
+          </w:tcPr>
+          <w:p>
+            <w:pPr>
+              <w:keepNext/>
+              <w:spacing w:after="40" w:before="40"/>
+              <w:jc w:val="left"/>
+            </w:pPr>
+            <w:r>
+              <w:rPr>
+                <w:rFonts w:ascii="Times New Roman" w:hAnsi="Times New Roman"/>
+                <w:b/>
+                <w:sz w:val="20"/>
+              </w:rPr>
+              <w:t>Register 20CS206 (4 credits)</w:t>
+            </w:r>
+          </w:p>
+        </w:tc>
+        <w:tc>
+          <w:tcPr>
+            <w:tcW w:type="dxa" w:w="3312"/>
+          </w:tcPr>
+          <w:p>
+            <w:pPr>
+              <w:keepNext/>
+              <w:spacing w:after="40" w:before="40"/>
+              <w:jc w:val="left"/>
+            </w:pPr>
+            <w:r>
+              <w:rPr>
+                <w:rFonts w:ascii="Times New Roman" w:hAnsi="Times New Roman"/>
+                <w:b w:val="0"/>
+                <w:sz w:val="20"/>
+              </w:rPr>
+              <w:t>Seats left = 0</w:t>
+            </w:r>
+          </w:p>
+        </w:tc>
+        <w:tc>
+          <w:tcPr>
+            <w:tcW w:type="dxa" w:w="2160"/>
+          </w:tcPr>
+          <w:p>
+            <w:pPr>
+              <w:keepNext/>
+              <w:spacing w:after="40" w:before="40"/>
+              <w:jc w:val="left"/>
+            </w:pPr>
+            <w:r>
+              <w:rPr>
+                <w:rFonts w:ascii="Times New Roman" w:hAnsi="Times New Roman"/>
+                <w:b w:val="0"/>
+                <w:sz w:val="20"/>
+              </w:rPr>
+              <w:t>Rejected: course is full</w:t>
+            </w:r>
+          </w:p>
+        </w:tc>
+      </w:tr>
+      <w:tr>
+        <w:trPr>
+          <w:cantSplit/>
+        </w:trPr>
+        <w:tc>
+          <w:tcPr>
+            <w:tcW w:type="dxa" w:w="3744"/>
+          </w:tcPr>
+          <w:p>
+            <w:pPr>
+              <w:keepNext/>
+              <w:spacing w:after="40" w:before="40"/>
+              <w:jc w:val="left"/>
+            </w:pPr>
+            <w:r>
+              <w:rPr>
+                <w:rFonts w:ascii="Times New Roman" w:hAnsi="Times New Roman"/>
+                <w:b/>
+                <w:sz w:val="20"/>
+              </w:rPr>
+              <w:t>Drop 20CS202</w:t>
+            </w:r>
+          </w:p>
+        </w:tc>
+        <w:tc>
+          <w:tcPr>
+            <w:tcW w:type="dxa" w:w="3312"/>
+          </w:tcPr>
+          <w:p>
+            <w:pPr>
+              <w:keepNext/>
+              <w:spacing w:after="40" w:before="40"/>
+              <w:jc w:val="left"/>
+            </w:pPr>
+            <w:r>
+              <w:rPr>
+                <w:rFonts w:ascii="Times New Roman" w:hAnsi="Times New Roman"/>
+                <w:b w:val="0"/>
+                <w:sz w:val="20"/>
+              </w:rPr>
+              <w:t>Course removed from the list</w:t>
+            </w:r>
+          </w:p>
+        </w:tc>
+        <w:tc>
+          <w:tcPr>
+            <w:tcW w:type="dxa" w:w="2160"/>
+          </w:tcPr>
+          <w:p>
+            <w:pPr>
+              <w:keepNext/>
+              <w:spacing w:after="40" w:before="40"/>
+              <w:jc w:val="left"/>
+            </w:pPr>
+            <w:r>
+              <w:rPr>
+                <w:rFonts w:ascii="Times New Roman" w:hAnsi="Times New Roman"/>
+                <w:b w:val="0"/>
+                <w:sz w:val="20"/>
+              </w:rPr>
+              <w:t>Credits return to 3 / 24</w:t>
+            </w:r>
+          </w:p>
+        </w:tc>
+      </w:tr>
+      <w:tr>
+        <w:trPr>
+          <w:cantSplit/>
+        </w:trPr>
+        <w:tc>
+          <w:tcPr>
+            <w:tcW w:type="dxa" w:w="3744"/>
+          </w:tcPr>
+          <w:p>
+            <w:pPr>
+              <w:spacing w:after="40" w:before="40"/>
+              <w:jc w:val="left"/>
+            </w:pPr>
+            <w:r>
+              <w:rPr>
+                <w:rFonts w:ascii="Times New Roman" w:hAnsi="Times New Roman"/>
+                <w:b/>
+                <w:sz w:val="20"/>
+              </w:rPr>
+              <w:t>Open Timetable</w:t>
+            </w:r>
+          </w:p>
+        </w:tc>
+        <w:tc>
+          <w:tcPr>
+            <w:tcW w:type="dxa" w:w="3312"/>
+          </w:tcPr>
+          <w:p>
+            <w:pPr>
+              <w:spacing w:after="40" w:before="40"/>
+              <w:jc w:val="left"/>
+            </w:pPr>
+            <w:r>
+              <w:rPr>
+                <w:rFonts w:ascii="Times New Roman" w:hAnsi="Times New Roman"/>
+                <w:b w:val="0"/>
+                <w:sz w:val="20"/>
+              </w:rPr>
+              <w:t>Slots mapped to periods</w:t>
+            </w:r>
+          </w:p>
+        </w:tc>
+        <w:tc>
+          <w:tcPr>
+            <w:tcW w:type="dxa" w:w="2160"/>
+          </w:tcPr>
+          <w:p>
+            <w:pPr>
+              <w:spacing w:after="40" w:before="40"/>
+              <w:jc w:val="left"/>
+            </w:pPr>
+            <w:r>
+              <w:rPr>
+                <w:rFonts w:ascii="Times New Roman" w:hAnsi="Times New Roman"/>
+                <w:b w:val="0"/>
+                <w:sz w:val="20"/>
+              </w:rPr>
+              <w:t>Mon-1 and Wed-2 highlighted</w:t>
+            </w:r>
+          </w:p>
+        </w:tc>
+      </w:tr>
+    </w:tbl>
+    <w:p>
+      <w:pPr>
+        <w:spacing w:after="80" w:before="0" w:line="276" w:lineRule="auto"/>
+        <w:jc w:val="both"/>
+      </w:pPr>
+    </w:p>
+    <w:p>
+      <w:pPr>
+        <w:keepNext/>
+        <w:pageBreakBefore/>
         <w:pBdr>
           <w:bottom w:val="single" w:sz="8" w:space="1" w:color="000000"/>
         </w:pBdr>
@@ -7111,6 +8850,823 @@
         <w:spacing w:after="80" w:before="0" w:line="276" w:lineRule="auto"/>
         <w:jc w:val="both"/>
       </w:pPr>
+    </w:p>
+    <w:p>
+      <w:pPr>
+        <w:keepNext/>
+        <w:spacing w:after="80" w:before="120" w:line="276" w:lineRule="auto"/>
+        <w:jc w:val="left"/>
+      </w:pPr>
+      <w:r>
+        <w:rPr>
+          <w:rFonts w:ascii="Times New Roman" w:hAnsi="Times New Roman" w:eastAsia="Times New Roman"/>
+          <w:b/>
+          <w:i w:val="0"/>
+          <w:sz w:val="24"/>
+        </w:rPr>
+        <w:t>3.5 Folder structure</w:t>
+      </w:r>
+    </w:p>
+    <w:tbl>
+      <w:tblPr>
+        <w:tblW w:type="auto" w:w="0"/>
+        <w:tblBorders>
+          <w:top w:val="single" w:sz="8" w:space="0" w:color="000000"/>
+          <w:left w:val="single" w:sz="8" w:space="0" w:color="000000"/>
+          <w:bottom w:val="single" w:sz="8" w:space="0" w:color="000000"/>
+          <w:right w:val="single" w:sz="8" w:space="0" w:color="000000"/>
+          <w:insideH w:val="single" w:sz="8" w:space="0" w:color="000000"/>
+          <w:insideV w:val="single" w:sz="8" w:space="0" w:color="000000"/>
+        </w:tblBorders>
+        <w:tblLayout w:type="fixed"/>
+        <w:tblLook w:firstColumn="1" w:firstRow="1" w:lastColumn="0" w:lastRow="0" w:noHBand="0" w:noVBand="1" w:val="04A0"/>
+      </w:tblPr>
+      <w:tblGrid>
+        <w:gridCol w:w="9333"/>
+      </w:tblGrid>
+      <w:tr>
+        <w:tc>
+          <w:tcPr>
+            <w:tcW w:type="dxa" w:w="9216"/>
+            <w:shd w:val="clear" w:color="auto" w:fill="F5F5F5"/>
+          </w:tcPr>
+          <w:p>
+            <w:pPr>
+              <w:spacing w:after="0" w:before="0" w:line="240" w:lineRule="auto"/>
+              <w:jc w:val="left"/>
+            </w:pPr>
+            <w:r>
+              <w:rPr>
+                <w:rFonts w:ascii="Courier New" w:hAnsi="Courier New" w:cs="Courier New"/>
+                <w:sz w:val="18"/>
+              </w:rPr>
+              <w:t>student-course-registration/</w:t>
+            </w:r>
+          </w:p>
+          <w:p>
+            <w:pPr>
+              <w:spacing w:after="0" w:before="0" w:line="240" w:lineRule="auto"/>
+              <w:jc w:val="left"/>
+            </w:pPr>
+            <w:r>
+              <w:rPr>
+                <w:rFonts w:ascii="Courier New" w:hAnsi="Courier New" w:cs="Courier New"/>
+                <w:sz w:val="18"/>
+              </w:rPr>
+              <w:t>|-- index.html     (structure of the pages)</w:t>
+            </w:r>
+          </w:p>
+          <w:p>
+            <w:pPr>
+              <w:spacing w:after="0" w:before="0" w:line="240" w:lineRule="auto"/>
+              <w:jc w:val="left"/>
+            </w:pPr>
+            <w:r>
+              <w:rPr>
+                <w:rFonts w:ascii="Courier New" w:hAnsi="Courier New" w:cs="Courier New"/>
+                <w:sz w:val="18"/>
+              </w:rPr>
+              <w:t>|-- style.css      (design and responsive rules)</w:t>
+            </w:r>
+          </w:p>
+          <w:p>
+            <w:pPr>
+              <w:spacing w:after="0" w:before="0" w:line="240" w:lineRule="auto"/>
+              <w:jc w:val="left"/>
+            </w:pPr>
+            <w:r>
+              <w:rPr>
+                <w:rFonts w:ascii="Courier New" w:hAnsi="Courier New" w:cs="Courier New"/>
+                <w:sz w:val="18"/>
+              </w:rPr>
+              <w:t>|-- script.js      (data, logic and localStorage)</w:t>
+            </w:r>
+          </w:p>
+          <w:p>
+            <w:pPr>
+              <w:spacing w:after="0" w:before="0" w:line="240" w:lineRule="auto"/>
+              <w:jc w:val="left"/>
+            </w:pPr>
+            <w:r>
+              <w:rPr>
+                <w:rFonts w:ascii="Courier New" w:hAnsi="Courier New" w:cs="Courier New"/>
+                <w:sz w:val="18"/>
+              </w:rPr>
+              <w:t>`-- shots/         (output screenshots used in this report)</w:t>
+            </w:r>
+          </w:p>
+        </w:tc>
+      </w:tr>
+    </w:tbl>
+    <w:p>
+      <w:pPr>
+        <w:spacing w:after="80" w:before="0" w:line="276" w:lineRule="auto"/>
+        <w:jc w:val="both"/>
+      </w:pPr>
+    </w:p>
+    <w:p>
+      <w:pPr>
+        <w:keepNext/>
+        <w:spacing w:after="80" w:before="120" w:line="276" w:lineRule="auto"/>
+        <w:jc w:val="left"/>
+      </w:pPr>
+      <w:r>
+        <w:rPr>
+          <w:rFonts w:ascii="Times New Roman" w:hAnsi="Times New Roman" w:eastAsia="Times New Roman"/>
+          <w:b/>
+          <w:i w:val="0"/>
+          <w:sz w:val="24"/>
+        </w:rPr>
+        <w:t>3.6 How to run the application</w:t>
+      </w:r>
+    </w:p>
+    <w:p>
+      <w:pPr>
+        <w:spacing w:after="80" w:before="0" w:line="276" w:lineRule="auto"/>
+        <w:jc w:val="both"/>
+      </w:pPr>
+      <w:r>
+        <w:rPr>
+          <w:rFonts w:ascii="Times New Roman" w:hAnsi="Times New Roman"/>
+          <w:b/>
+          <w:sz w:val="24"/>
+        </w:rPr>
+        <w:t xml:space="preserve">Step 1: </w:t>
+      </w:r>
+      <w:r>
+        <w:rPr>
+          <w:rFonts w:ascii="Times New Roman" w:hAnsi="Times New Roman"/>
+          <w:b w:val="0"/>
+          <w:sz w:val="24"/>
+        </w:rPr>
+        <w:t>Copy the three files index.html, style.css and script.js into one folder.</w:t>
+      </w:r>
+    </w:p>
+    <w:p>
+      <w:pPr>
+        <w:spacing w:after="80" w:before="0" w:line="276" w:lineRule="auto"/>
+        <w:jc w:val="both"/>
+      </w:pPr>
+      <w:r>
+        <w:rPr>
+          <w:rFonts w:ascii="Times New Roman" w:hAnsi="Times New Roman"/>
+          <w:b/>
+          <w:sz w:val="24"/>
+        </w:rPr>
+        <w:t xml:space="preserve">Step 2: </w:t>
+      </w:r>
+      <w:r>
+        <w:rPr>
+          <w:rFonts w:ascii="Times New Roman" w:hAnsi="Times New Roman"/>
+          <w:b w:val="0"/>
+          <w:sz w:val="24"/>
+        </w:rPr>
+        <w:t>Double-click index.html; it opens in the default browser and shows the login page.</w:t>
+      </w:r>
+    </w:p>
+    <w:p>
+      <w:pPr>
+        <w:spacing w:after="80" w:before="0" w:line="276" w:lineRule="auto"/>
+        <w:jc w:val="both"/>
+      </w:pPr>
+      <w:r>
+        <w:rPr>
+          <w:rFonts w:ascii="Times New Roman" w:hAnsi="Times New Roman"/>
+          <w:b/>
+          <w:sz w:val="24"/>
+        </w:rPr>
+        <w:t xml:space="preserve">Step 3: </w:t>
+      </w:r>
+      <w:r>
+        <w:rPr>
+          <w:rFonts w:ascii="Times New Roman" w:hAnsi="Times New Roman"/>
+          <w:b w:val="0"/>
+          <w:sz w:val="24"/>
+        </w:rPr>
+        <w:t>Log in with one of the sample accounts given below.</w:t>
+      </w:r>
+    </w:p>
+    <w:p>
+      <w:pPr>
+        <w:spacing w:after="80" w:before="0" w:line="276" w:lineRule="auto"/>
+        <w:jc w:val="both"/>
+      </w:pPr>
+      <w:r>
+        <w:rPr>
+          <w:rFonts w:ascii="Times New Roman" w:hAnsi="Times New Roman"/>
+          <w:b/>
+          <w:sz w:val="24"/>
+        </w:rPr>
+        <w:t xml:space="preserve">Step 4: </w:t>
+      </w:r>
+      <w:r>
+        <w:rPr>
+          <w:rFonts w:ascii="Times New Roman" w:hAnsi="Times New Roman"/>
+          <w:b w:val="0"/>
+          <w:sz w:val="24"/>
+        </w:rPr>
+        <w:t>Register courses, open the other tabs and use Logout when finished.</w:t>
+      </w:r>
+    </w:p>
+    <w:p>
+      <w:pPr>
+        <w:keepNext/>
+        <w:spacing w:after="80" w:before="120" w:line="276" w:lineRule="auto"/>
+        <w:jc w:val="left"/>
+      </w:pPr>
+      <w:r>
+        <w:rPr>
+          <w:rFonts w:ascii="Times New Roman" w:hAnsi="Times New Roman" w:eastAsia="Times New Roman"/>
+          <w:b/>
+          <w:i w:val="0"/>
+          <w:sz w:val="24"/>
+        </w:rPr>
+        <w:t>3.7 Sample student accounts</w:t>
+      </w:r>
+    </w:p>
+    <w:tbl>
+      <w:tblPr>
+        <w:tblW w:type="auto" w:w="0"/>
+        <w:tblBorders>
+          <w:top w:val="single" w:sz="6" w:space="0" w:color="000000"/>
+          <w:left w:val="single" w:sz="6" w:space="0" w:color="000000"/>
+          <w:bottom w:val="single" w:sz="6" w:space="0" w:color="000000"/>
+          <w:right w:val="single" w:sz="6" w:space="0" w:color="000000"/>
+          <w:insideH w:val="single" w:sz="6" w:space="0" w:color="000000"/>
+          <w:insideV w:val="single" w:sz="6" w:space="0" w:color="000000"/>
+        </w:tblBorders>
+        <w:tblLayout w:type="fixed"/>
+        <w:tblLook w:firstColumn="1" w:firstRow="1" w:lastColumn="0" w:lastRow="0" w:noHBand="0" w:noVBand="1" w:val="04A0"/>
+      </w:tblPr>
+      <w:tblGrid>
+        <w:gridCol w:w="1008"/>
+        <w:gridCol w:w="3168"/>
+        <w:gridCol w:w="3168"/>
+        <w:gridCol w:w="1872"/>
+      </w:tblGrid>
+      <w:tr>
+        <w:trPr>
+          <w:tblHeader/>
+          <w:cantSplit/>
+        </w:trPr>
+        <w:tc>
+          <w:tcPr>
+            <w:tcW w:type="dxa" w:w="1008"/>
+            <w:shd w:val="clear" w:color="auto" w:fill="D9E2D5"/>
+          </w:tcPr>
+          <w:p>
+            <w:pPr>
+              <w:keepNext/>
+              <w:spacing w:after="40" w:before="40"/>
+              <w:jc w:val="center"/>
+            </w:pPr>
+            <w:r>
+              <w:rPr>
+                <w:rFonts w:ascii="Times New Roman" w:hAnsi="Times New Roman"/>
+                <w:b/>
+                <w:sz w:val="22"/>
+              </w:rPr>
+              <w:t>S. No.</w:t>
+            </w:r>
+          </w:p>
+        </w:tc>
+        <w:tc>
+          <w:tcPr>
+            <w:tcW w:type="dxa" w:w="3168"/>
+            <w:shd w:val="clear" w:color="auto" w:fill="D9E2D5"/>
+          </w:tcPr>
+          <w:p>
+            <w:pPr>
+              <w:keepNext/>
+              <w:spacing w:after="40" w:before="40"/>
+              <w:jc w:val="center"/>
+            </w:pPr>
+            <w:r>
+              <w:rPr>
+                <w:rFonts w:ascii="Times New Roman" w:hAnsi="Times New Roman"/>
+                <w:b/>
+                <w:sz w:val="22"/>
+              </w:rPr>
+              <w:t>Name</w:t>
+            </w:r>
+          </w:p>
+        </w:tc>
+        <w:tc>
+          <w:tcPr>
+            <w:tcW w:type="dxa" w:w="3168"/>
+            <w:shd w:val="clear" w:color="auto" w:fill="D9E2D5"/>
+          </w:tcPr>
+          <w:p>
+            <w:pPr>
+              <w:keepNext/>
+              <w:spacing w:after="40" w:before="40"/>
+              <w:jc w:val="center"/>
+            </w:pPr>
+            <w:r>
+              <w:rPr>
+                <w:rFonts w:ascii="Times New Roman" w:hAnsi="Times New Roman"/>
+                <w:b/>
+                <w:sz w:val="22"/>
+              </w:rPr>
+              <w:t>Roll number (user name)</w:t>
+            </w:r>
+          </w:p>
+        </w:tc>
+        <w:tc>
+          <w:tcPr>
+            <w:tcW w:type="dxa" w:w="1872"/>
+            <w:shd w:val="clear" w:color="auto" w:fill="D9E2D5"/>
+          </w:tcPr>
+          <w:p>
+            <w:pPr>
+              <w:keepNext/>
+              <w:spacing w:after="40" w:before="40"/>
+              <w:jc w:val="center"/>
+            </w:pPr>
+            <w:r>
+              <w:rPr>
+                <w:rFonts w:ascii="Times New Roman" w:hAnsi="Times New Roman"/>
+                <w:b/>
+                <w:sz w:val="22"/>
+              </w:rPr>
+              <w:t>Password</w:t>
+            </w:r>
+          </w:p>
+        </w:tc>
+      </w:tr>
+      <w:tr>
+        <w:trPr>
+          <w:cantSplit/>
+        </w:trPr>
+        <w:tc>
+          <w:tcPr>
+            <w:tcW w:type="dxa" w:w="1008"/>
+          </w:tcPr>
+          <w:p>
+            <w:pPr>
+              <w:keepNext/>
+              <w:spacing w:after="40" w:before="40"/>
+              <w:jc w:val="left"/>
+            </w:pPr>
+            <w:r>
+              <w:rPr>
+                <w:rFonts w:ascii="Times New Roman" w:hAnsi="Times New Roman"/>
+                <w:b/>
+                <w:sz w:val="22"/>
+              </w:rPr>
+              <w:t>1</w:t>
+            </w:r>
+          </w:p>
+        </w:tc>
+        <w:tc>
+          <w:tcPr>
+            <w:tcW w:type="dxa" w:w="3168"/>
+          </w:tcPr>
+          <w:p>
+            <w:pPr>
+              <w:keepNext/>
+              <w:spacing w:after="40" w:before="40"/>
+              <w:jc w:val="left"/>
+            </w:pPr>
+            <w:r>
+              <w:rPr>
+                <w:rFonts w:ascii="Times New Roman" w:hAnsi="Times New Roman"/>
+                <w:b w:val="0"/>
+                <w:sz w:val="22"/>
+              </w:rPr>
+              <w:t>AISHWARYA U</w:t>
+            </w:r>
+          </w:p>
+        </w:tc>
+        <w:tc>
+          <w:tcPr>
+            <w:tcW w:type="dxa" w:w="3168"/>
+          </w:tcPr>
+          <w:p>
+            <w:pPr>
+              <w:keepNext/>
+              <w:spacing w:after="40" w:before="40"/>
+              <w:jc w:val="left"/>
+            </w:pPr>
+            <w:r>
+              <w:rPr>
+                <w:rFonts w:ascii="Times New Roman" w:hAnsi="Times New Roman"/>
+                <w:b w:val="0"/>
+                <w:sz w:val="22"/>
+              </w:rPr>
+              <w:t>71812401006</w:t>
+            </w:r>
+          </w:p>
+        </w:tc>
+        <w:tc>
+          <w:tcPr>
+            <w:tcW w:type="dxa" w:w="1872"/>
+          </w:tcPr>
+          <w:p>
+            <w:pPr>
+              <w:keepNext/>
+              <w:spacing w:after="40" w:before="40"/>
+              <w:jc w:val="left"/>
+            </w:pPr>
+            <w:r>
+              <w:rPr>
+                <w:rFonts w:ascii="Times New Roman" w:hAnsi="Times New Roman"/>
+                <w:b w:val="0"/>
+                <w:sz w:val="22"/>
+              </w:rPr>
+              <w:t>Srec@2026</w:t>
+            </w:r>
+          </w:p>
+        </w:tc>
+      </w:tr>
+      <w:tr>
+        <w:trPr>
+          <w:cantSplit/>
+        </w:trPr>
+        <w:tc>
+          <w:tcPr>
+            <w:tcW w:type="dxa" w:w="1008"/>
+          </w:tcPr>
+          <w:p>
+            <w:pPr>
+              <w:keepNext/>
+              <w:spacing w:after="40" w:before="40"/>
+              <w:jc w:val="left"/>
+            </w:pPr>
+            <w:r>
+              <w:rPr>
+                <w:rFonts w:ascii="Times New Roman" w:hAnsi="Times New Roman"/>
+                <w:b/>
+                <w:sz w:val="22"/>
+              </w:rPr>
+              <w:t>2</w:t>
+            </w:r>
+          </w:p>
+        </w:tc>
+        <w:tc>
+          <w:tcPr>
+            <w:tcW w:type="dxa" w:w="3168"/>
+          </w:tcPr>
+          <w:p>
+            <w:pPr>
+              <w:keepNext/>
+              <w:spacing w:after="40" w:before="40"/>
+              <w:jc w:val="left"/>
+            </w:pPr>
+            <w:r>
+              <w:rPr>
+                <w:rFonts w:ascii="Times New Roman" w:hAnsi="Times New Roman"/>
+                <w:b w:val="0"/>
+                <w:sz w:val="22"/>
+              </w:rPr>
+              <w:t>AJAY IYANRAJ</w:t>
+            </w:r>
+          </w:p>
+        </w:tc>
+        <w:tc>
+          <w:tcPr>
+            <w:tcW w:type="dxa" w:w="3168"/>
+          </w:tcPr>
+          <w:p>
+            <w:pPr>
+              <w:keepNext/>
+              <w:spacing w:after="40" w:before="40"/>
+              <w:jc w:val="left"/>
+            </w:pPr>
+            <w:r>
+              <w:rPr>
+                <w:rFonts w:ascii="Times New Roman" w:hAnsi="Times New Roman"/>
+                <w:b w:val="0"/>
+                <w:sz w:val="22"/>
+              </w:rPr>
+              <w:t>71812401007</w:t>
+            </w:r>
+          </w:p>
+        </w:tc>
+        <w:tc>
+          <w:tcPr>
+            <w:tcW w:type="dxa" w:w="1872"/>
+          </w:tcPr>
+          <w:p>
+            <w:pPr>
+              <w:keepNext/>
+              <w:spacing w:after="40" w:before="40"/>
+              <w:jc w:val="left"/>
+            </w:pPr>
+            <w:r>
+              <w:rPr>
+                <w:rFonts w:ascii="Times New Roman" w:hAnsi="Times New Roman"/>
+                <w:b w:val="0"/>
+                <w:sz w:val="22"/>
+              </w:rPr>
+              <w:t>Srec@2026</w:t>
+            </w:r>
+          </w:p>
+        </w:tc>
+      </w:tr>
+      <w:tr>
+        <w:trPr>
+          <w:cantSplit/>
+        </w:trPr>
+        <w:tc>
+          <w:tcPr>
+            <w:tcW w:type="dxa" w:w="1008"/>
+          </w:tcPr>
+          <w:p>
+            <w:pPr>
+              <w:keepNext/>
+              <w:spacing w:after="40" w:before="40"/>
+              <w:jc w:val="left"/>
+            </w:pPr>
+            <w:r>
+              <w:rPr>
+                <w:rFonts w:ascii="Times New Roman" w:hAnsi="Times New Roman"/>
+                <w:b/>
+                <w:sz w:val="22"/>
+              </w:rPr>
+              <w:t>3</w:t>
+            </w:r>
+          </w:p>
+        </w:tc>
+        <w:tc>
+          <w:tcPr>
+            <w:tcW w:type="dxa" w:w="3168"/>
+          </w:tcPr>
+          <w:p>
+            <w:pPr>
+              <w:keepNext/>
+              <w:spacing w:after="40" w:before="40"/>
+              <w:jc w:val="left"/>
+            </w:pPr>
+            <w:r>
+              <w:rPr>
+                <w:rFonts w:ascii="Times New Roman" w:hAnsi="Times New Roman"/>
+                <w:b w:val="0"/>
+                <w:sz w:val="22"/>
+              </w:rPr>
+              <w:t>AKASHVARMAN R</w:t>
+            </w:r>
+          </w:p>
+        </w:tc>
+        <w:tc>
+          <w:tcPr>
+            <w:tcW w:type="dxa" w:w="3168"/>
+          </w:tcPr>
+          <w:p>
+            <w:pPr>
+              <w:keepNext/>
+              <w:spacing w:after="40" w:before="40"/>
+              <w:jc w:val="left"/>
+            </w:pPr>
+            <w:r>
+              <w:rPr>
+                <w:rFonts w:ascii="Times New Roman" w:hAnsi="Times New Roman"/>
+                <w:b w:val="0"/>
+                <w:sz w:val="22"/>
+              </w:rPr>
+              <w:t>71812401008</w:t>
+            </w:r>
+          </w:p>
+        </w:tc>
+        <w:tc>
+          <w:tcPr>
+            <w:tcW w:type="dxa" w:w="1872"/>
+          </w:tcPr>
+          <w:p>
+            <w:pPr>
+              <w:keepNext/>
+              <w:spacing w:after="40" w:before="40"/>
+              <w:jc w:val="left"/>
+            </w:pPr>
+            <w:r>
+              <w:rPr>
+                <w:rFonts w:ascii="Times New Roman" w:hAnsi="Times New Roman"/>
+                <w:b w:val="0"/>
+                <w:sz w:val="22"/>
+              </w:rPr>
+              <w:t>Srec@2026</w:t>
+            </w:r>
+          </w:p>
+        </w:tc>
+      </w:tr>
+      <w:tr>
+        <w:trPr>
+          <w:cantSplit/>
+        </w:trPr>
+        <w:tc>
+          <w:tcPr>
+            <w:tcW w:type="dxa" w:w="1008"/>
+          </w:tcPr>
+          <w:p>
+            <w:pPr>
+              <w:spacing w:after="40" w:before="40"/>
+              <w:jc w:val="left"/>
+            </w:pPr>
+            <w:r>
+              <w:rPr>
+                <w:rFonts w:ascii="Times New Roman" w:hAnsi="Times New Roman"/>
+                <w:b/>
+                <w:sz w:val="22"/>
+              </w:rPr>
+              <w:t>4</w:t>
+            </w:r>
+          </w:p>
+        </w:tc>
+        <w:tc>
+          <w:tcPr>
+            <w:tcW w:type="dxa" w:w="3168"/>
+          </w:tcPr>
+          <w:p>
+            <w:pPr>
+              <w:spacing w:after="40" w:before="40"/>
+              <w:jc w:val="left"/>
+            </w:pPr>
+            <w:r>
+              <w:rPr>
+                <w:rFonts w:ascii="Times New Roman" w:hAnsi="Times New Roman"/>
+                <w:b w:val="0"/>
+                <w:sz w:val="22"/>
+              </w:rPr>
+              <w:t>AKHILESH RAJ P</w:t>
+            </w:r>
+          </w:p>
+        </w:tc>
+        <w:tc>
+          <w:tcPr>
+            <w:tcW w:type="dxa" w:w="3168"/>
+          </w:tcPr>
+          <w:p>
+            <w:pPr>
+              <w:spacing w:after="40" w:before="40"/>
+              <w:jc w:val="left"/>
+            </w:pPr>
+            <w:r>
+              <w:rPr>
+                <w:rFonts w:ascii="Times New Roman" w:hAnsi="Times New Roman"/>
+                <w:b w:val="0"/>
+                <w:sz w:val="22"/>
+              </w:rPr>
+              <w:t>71812401009</w:t>
+            </w:r>
+          </w:p>
+        </w:tc>
+        <w:tc>
+          <w:tcPr>
+            <w:tcW w:type="dxa" w:w="1872"/>
+          </w:tcPr>
+          <w:p>
+            <w:pPr>
+              <w:spacing w:after="40" w:before="40"/>
+              <w:jc w:val="left"/>
+            </w:pPr>
+            <w:r>
+              <w:rPr>
+                <w:rFonts w:ascii="Times New Roman" w:hAnsi="Times New Roman"/>
+                <w:b w:val="0"/>
+                <w:sz w:val="22"/>
+              </w:rPr>
+              <w:t>Srec@2026</w:t>
+            </w:r>
+          </w:p>
+        </w:tc>
+      </w:tr>
+    </w:tbl>
+    <w:p>
+      <w:pPr>
+        <w:spacing w:after="80" w:before="0" w:line="276" w:lineRule="auto"/>
+        <w:jc w:val="both"/>
+      </w:pPr>
+    </w:p>
+    <w:p>
+      <w:pPr>
+        <w:keepNext/>
+        <w:spacing w:after="80" w:before="120" w:line="276" w:lineRule="auto"/>
+        <w:jc w:val="left"/>
+      </w:pPr>
+      <w:r>
+        <w:rPr>
+          <w:rFonts w:ascii="Times New Roman" w:hAnsi="Times New Roman" w:eastAsia="Times New Roman"/>
+          <w:b/>
+          <w:i w:val="0"/>
+          <w:sz w:val="24"/>
+        </w:rPr>
+        <w:t>3.8 Coding conventions followed</w:t>
+      </w:r>
+    </w:p>
+    <w:p>
+      <w:pPr>
+        <w:spacing w:after="80" w:before="0" w:line="276" w:lineRule="auto"/>
+        <w:ind w:left="432" w:hanging="288"/>
+        <w:jc w:val="both"/>
+      </w:pPr>
+      <w:r>
+        <w:rPr>
+          <w:rFonts w:ascii="Times New Roman" w:hAnsi="Times New Roman"/>
+          <w:b w:val="0"/>
+          <w:sz w:val="24"/>
+        </w:rPr>
+        <w:t xml:space="preserve">•  </w:t>
+      </w:r>
+      <w:r>
+        <w:rPr>
+          <w:rFonts w:ascii="Times New Roman" w:hAnsi="Times New Roman"/>
+          <w:b w:val="0"/>
+          <w:sz w:val="24"/>
+        </w:rPr>
+        <w:t>Meaningful names for functions and variables (registerCourse, seatsLeft, totalCredits).</w:t>
+      </w:r>
+    </w:p>
+    <w:p>
+      <w:pPr>
+        <w:spacing w:after="80" w:before="0" w:line="276" w:lineRule="auto"/>
+        <w:ind w:left="432" w:hanging="288"/>
+        <w:jc w:val="both"/>
+      </w:pPr>
+      <w:r>
+        <w:rPr>
+          <w:rFonts w:ascii="Times New Roman" w:hAnsi="Times New Roman"/>
+          <w:b w:val="0"/>
+          <w:sz w:val="24"/>
+        </w:rPr>
+        <w:t xml:space="preserve">•  </w:t>
+      </w:r>
+      <w:r>
+        <w:rPr>
+          <w:rFonts w:ascii="Times New Roman" w:hAnsi="Times New Roman"/>
+          <w:b w:val="0"/>
+          <w:sz w:val="24"/>
+        </w:rPr>
+        <w:t>Data (courses, students) is kept separate from the display and rule functions.</w:t>
+      </w:r>
+    </w:p>
+    <w:p>
+      <w:pPr>
+        <w:spacing w:after="80" w:before="0" w:line="276" w:lineRule="auto"/>
+        <w:ind w:left="432" w:hanging="288"/>
+        <w:jc w:val="both"/>
+      </w:pPr>
+      <w:r>
+        <w:rPr>
+          <w:rFonts w:ascii="Times New Roman" w:hAnsi="Times New Roman"/>
+          <w:b w:val="0"/>
+          <w:sz w:val="24"/>
+        </w:rPr>
+        <w:t xml:space="preserve">•  </w:t>
+      </w:r>
+      <w:r>
+        <w:rPr>
+          <w:rFonts w:ascii="Times New Roman" w:hAnsi="Times New Roman"/>
+          <w:b w:val="0"/>
+          <w:sz w:val="24"/>
+        </w:rPr>
+        <w:t>Comments mark every section of the script: data, storage, login, tabs, catalogue, register / drop, timetable.</w:t>
+      </w:r>
+    </w:p>
+    <w:p>
+      <w:pPr>
+        <w:spacing w:after="80" w:before="0" w:line="276" w:lineRule="auto"/>
+        <w:ind w:left="432" w:hanging="288"/>
+        <w:jc w:val="both"/>
+      </w:pPr>
+      <w:r>
+        <w:rPr>
+          <w:rFonts w:ascii="Times New Roman" w:hAnsi="Times New Roman"/>
+          <w:b w:val="0"/>
+          <w:sz w:val="24"/>
+        </w:rPr>
+        <w:t xml:space="preserve">•  </w:t>
+      </w:r>
+      <w:r>
+        <w:rPr>
+          <w:rFonts w:ascii="Times New Roman" w:hAnsi="Times New Roman"/>
+          <w:b w:val="0"/>
+          <w:sz w:val="24"/>
+        </w:rPr>
+        <w:t>One function performs one job, so each rule can be tested separately.</w:t>
+      </w:r>
+    </w:p>
+    <w:p>
+      <w:pPr>
+        <w:spacing w:after="80" w:before="0" w:line="276" w:lineRule="auto"/>
+        <w:ind w:left="432" w:hanging="288"/>
+        <w:jc w:val="both"/>
+      </w:pPr>
+      <w:r>
+        <w:rPr>
+          <w:rFonts w:ascii="Times New Roman" w:hAnsi="Times New Roman"/>
+          <w:b w:val="0"/>
+          <w:sz w:val="24"/>
+        </w:rPr>
+        <w:t xml:space="preserve">•  </w:t>
+      </w:r>
+      <w:r>
+        <w:rPr>
+          <w:rFonts w:ascii="Times New Roman" w:hAnsi="Times New Roman"/>
+          <w:b w:val="0"/>
+          <w:sz w:val="24"/>
+        </w:rPr>
+        <w:t>Constants such as MAX_CREDITS are declared once and reused.</w:t>
+      </w:r>
     </w:p>
     <w:p>
       <w:pPr>
@@ -12082,6 +14638,7 @@
     <w:p>
       <w:pPr>
         <w:keepNext/>
+        <w:pageBreakBefore/>
         <w:pBdr>
           <w:bottom w:val="single" w:sz="8" w:space="1" w:color="000000"/>
         </w:pBdr>
@@ -12112,6 +14669,273 @@
         </w:rPr>
         <w:t>The Student Course Registration System was designed and implemented with HTML5, CSS3 and JavaScript. It allows a student to log in, search and filter the courses, register and drop courses and view the credits and the timetable. The rules for seat availability, credit limit and time clash are applied automatically, which removes the manual work and the mistakes of the paper based process. The test cases and the screenshots show that the application works correctly on desktop and mobile screens.</w:t>
       </w:r>
+    </w:p>
+    <w:p>
+      <w:pPr>
+        <w:keepNext/>
+        <w:spacing w:after="80" w:before="120" w:line="276" w:lineRule="auto"/>
+        <w:jc w:val="left"/>
+      </w:pPr>
+      <w:r>
+        <w:rPr>
+          <w:rFonts w:ascii="Times New Roman" w:hAnsi="Times New Roman" w:eastAsia="Times New Roman"/>
+          <w:b/>
+          <w:i w:val="0"/>
+          <w:sz w:val="24"/>
+        </w:rPr>
+        <w:t>Challenges faced and solutions</w:t>
+      </w:r>
+    </w:p>
+    <w:tbl>
+      <w:tblPr>
+        <w:tblW w:type="auto" w:w="0"/>
+        <w:tblBorders>
+          <w:top w:val="single" w:sz="6" w:space="0" w:color="000000"/>
+          <w:left w:val="single" w:sz="6" w:space="0" w:color="000000"/>
+          <w:bottom w:val="single" w:sz="6" w:space="0" w:color="000000"/>
+          <w:right w:val="single" w:sz="6" w:space="0" w:color="000000"/>
+          <w:insideH w:val="single" w:sz="6" w:space="0" w:color="000000"/>
+          <w:insideV w:val="single" w:sz="6" w:space="0" w:color="000000"/>
+        </w:tblBorders>
+        <w:tblLayout w:type="fixed"/>
+        <w:tblLook w:firstColumn="1" w:firstRow="1" w:lastColumn="0" w:lastRow="0" w:noHBand="0" w:noVBand="1" w:val="04A0"/>
+      </w:tblPr>
+      <w:tblGrid>
+        <w:gridCol w:w="3744"/>
+        <w:gridCol w:w="5472"/>
+      </w:tblGrid>
+      <w:tr>
+        <w:trPr>
+          <w:tblHeader/>
+          <w:cantSplit/>
+        </w:trPr>
+        <w:tc>
+          <w:tcPr>
+            <w:tcW w:type="dxa" w:w="3744"/>
+            <w:shd w:val="clear" w:color="auto" w:fill="D9E2D5"/>
+          </w:tcPr>
+          <w:p>
+            <w:pPr>
+              <w:keepNext/>
+              <w:spacing w:after="40" w:before="40"/>
+              <w:jc w:val="center"/>
+            </w:pPr>
+            <w:r>
+              <w:rPr>
+                <w:rFonts w:ascii="Times New Roman" w:hAnsi="Times New Roman"/>
+                <w:b/>
+                <w:sz w:val="22"/>
+              </w:rPr>
+              <w:t>Challenge</w:t>
+            </w:r>
+          </w:p>
+        </w:tc>
+        <w:tc>
+          <w:tcPr>
+            <w:tcW w:type="dxa" w:w="5472"/>
+            <w:shd w:val="clear" w:color="auto" w:fill="D9E2D5"/>
+          </w:tcPr>
+          <w:p>
+            <w:pPr>
+              <w:keepNext/>
+              <w:spacing w:after="40" w:before="40"/>
+              <w:jc w:val="center"/>
+            </w:pPr>
+            <w:r>
+              <w:rPr>
+                <w:rFonts w:ascii="Times New Roman" w:hAnsi="Times New Roman"/>
+                <w:b/>
+                <w:sz w:val="22"/>
+              </w:rPr>
+              <w:t>Solution</w:t>
+            </w:r>
+          </w:p>
+        </w:tc>
+      </w:tr>
+      <w:tr>
+        <w:trPr>
+          <w:cantSplit/>
+        </w:trPr>
+        <w:tc>
+          <w:tcPr>
+            <w:tcW w:type="dxa" w:w="3744"/>
+          </w:tcPr>
+          <w:p>
+            <w:pPr>
+              <w:keepNext/>
+              <w:spacing w:after="40" w:before="40"/>
+              <w:jc w:val="left"/>
+            </w:pPr>
+            <w:r>
+              <w:rPr>
+                <w:rFonts w:ascii="Times New Roman" w:hAnsi="Times New Roman"/>
+                <w:b/>
+                <w:sz w:val="22"/>
+              </w:rPr>
+              <w:t>Keeping the seat count correct for all students</w:t>
+            </w:r>
+          </w:p>
+        </w:tc>
+        <w:tc>
+          <w:tcPr>
+            <w:tcW w:type="dxa" w:w="5472"/>
+          </w:tcPr>
+          <w:p>
+            <w:pPr>
+              <w:keepNext/>
+              <w:spacing w:after="40" w:before="40"/>
+              <w:jc w:val="left"/>
+            </w:pPr>
+            <w:r>
+              <w:rPr>
+                <w:rFonts w:ascii="Times New Roman" w:hAnsi="Times New Roman"/>
+                <w:b w:val="0"/>
+                <w:sz w:val="22"/>
+              </w:rPr>
+              <w:t>Seats left are calculated from all stored registrations every time the page is drawn</w:t>
+            </w:r>
+          </w:p>
+        </w:tc>
+      </w:tr>
+      <w:tr>
+        <w:trPr>
+          <w:cantSplit/>
+        </w:trPr>
+        <w:tc>
+          <w:tcPr>
+            <w:tcW w:type="dxa" w:w="3744"/>
+          </w:tcPr>
+          <w:p>
+            <w:pPr>
+              <w:keepNext/>
+              <w:spacing w:after="40" w:before="40"/>
+              <w:jc w:val="left"/>
+            </w:pPr>
+            <w:r>
+              <w:rPr>
+                <w:rFonts w:ascii="Times New Roman" w:hAnsi="Times New Roman"/>
+                <w:b/>
+                <w:sz w:val="22"/>
+              </w:rPr>
+              <w:t>Finding a time clash between two courses</w:t>
+            </w:r>
+          </w:p>
+        </w:tc>
+        <w:tc>
+          <w:tcPr>
+            <w:tcW w:type="dxa" w:w="5472"/>
+          </w:tcPr>
+          <w:p>
+            <w:pPr>
+              <w:keepNext/>
+              <w:spacing w:after="40" w:before="40"/>
+              <w:jc w:val="left"/>
+            </w:pPr>
+            <w:r>
+              <w:rPr>
+                <w:rFonts w:ascii="Times New Roman" w:hAnsi="Times New Roman"/>
+                <w:b w:val="0"/>
+                <w:sz w:val="22"/>
+              </w:rPr>
+              <w:t>Each course stores its slots as Day-Period text and the slots are compared with find() and includes()</w:t>
+            </w:r>
+          </w:p>
+        </w:tc>
+      </w:tr>
+      <w:tr>
+        <w:trPr>
+          <w:cantSplit/>
+        </w:trPr>
+        <w:tc>
+          <w:tcPr>
+            <w:tcW w:type="dxa" w:w="3744"/>
+          </w:tcPr>
+          <w:p>
+            <w:pPr>
+              <w:keepNext/>
+              <w:spacing w:after="40" w:before="40"/>
+              <w:jc w:val="left"/>
+            </w:pPr>
+            <w:r>
+              <w:rPr>
+                <w:rFonts w:ascii="Times New Roman" w:hAnsi="Times New Roman"/>
+                <w:b/>
+                <w:sz w:val="22"/>
+              </w:rPr>
+              <w:t>Data lost on page refresh</w:t>
+            </w:r>
+          </w:p>
+        </w:tc>
+        <w:tc>
+          <w:tcPr>
+            <w:tcW w:type="dxa" w:w="5472"/>
+          </w:tcPr>
+          <w:p>
+            <w:pPr>
+              <w:keepNext/>
+              <w:spacing w:after="40" w:before="40"/>
+              <w:jc w:val="left"/>
+            </w:pPr>
+            <w:r>
+              <w:rPr>
+                <w:rFonts w:ascii="Times New Roman" w:hAnsi="Times New Roman"/>
+                <w:b w:val="0"/>
+                <w:sz w:val="22"/>
+              </w:rPr>
+              <w:t>The registrations are saved in localStorage after every register or drop</w:t>
+            </w:r>
+          </w:p>
+        </w:tc>
+      </w:tr>
+      <w:tr>
+        <w:trPr>
+          <w:cantSplit/>
+        </w:trPr>
+        <w:tc>
+          <w:tcPr>
+            <w:tcW w:type="dxa" w:w="3744"/>
+          </w:tcPr>
+          <w:p>
+            <w:pPr>
+              <w:spacing w:after="40" w:before="40"/>
+              <w:jc w:val="left"/>
+            </w:pPr>
+            <w:r>
+              <w:rPr>
+                <w:rFonts w:ascii="Times New Roman" w:hAnsi="Times New Roman"/>
+                <w:b/>
+                <w:sz w:val="22"/>
+              </w:rPr>
+              <w:t>Table too wide for a phone</w:t>
+            </w:r>
+          </w:p>
+        </w:tc>
+        <w:tc>
+          <w:tcPr>
+            <w:tcW w:type="dxa" w:w="5472"/>
+          </w:tcPr>
+          <w:p>
+            <w:pPr>
+              <w:spacing w:after="40" w:before="40"/>
+              <w:jc w:val="left"/>
+            </w:pPr>
+            <w:r>
+              <w:rPr>
+                <w:rFonts w:ascii="Times New Roman" w:hAnsi="Times New Roman"/>
+                <w:b w:val="0"/>
+                <w:sz w:val="22"/>
+              </w:rPr>
+              <w:t>A media query makes the table scroll horizontally on small screens</w:t>
+            </w:r>
+          </w:p>
+        </w:tc>
+      </w:tr>
+    </w:tbl>
+    <w:p>
+      <w:pPr>
+        <w:spacing w:after="80" w:before="0" w:line="276" w:lineRule="auto"/>
+        <w:jc w:val="both"/>
+      </w:pPr>
     </w:p>
     <w:p>
       <w:pPr>

</xml_diff>